<commit_message>
Commit changes to project
</commit_message>
<xml_diff>
--- a/Data Analysis Project/project/reports/Report.docx
+++ b/Data Analysis Project/project/reports/Report.docx
@@ -5,19 +5,119 @@
     <w:p>
       <w:pPr>
         <w:pStyle w:val="Heading1"/>
+        <w:jc w:val="center"/>
         <w:rPr>
           <w:color w:val="auto"/>
         </w:rPr>
       </w:pPr>
+      <w:bookmarkStart w:id="0" w:name="_Toc228368032"/>
+      <w:r>
+        <w:rPr>
+          <w:noProof/>
+        </w:rPr>
+        <w:drawing>
+          <wp:anchor distT="0" distB="0" distL="114300" distR="114300" simplePos="0" relativeHeight="251659264" behindDoc="1" locked="0" layoutInCell="1" allowOverlap="1" wp14:anchorId="6DAC56A9" wp14:editId="665137E6">
+            <wp:simplePos x="0" y="0"/>
+            <wp:positionH relativeFrom="margin">
+              <wp:align>center</wp:align>
+            </wp:positionH>
+            <wp:positionV relativeFrom="paragraph">
+              <wp:posOffset>0</wp:posOffset>
+            </wp:positionV>
+            <wp:extent cx="1874520" cy="502920"/>
+            <wp:effectExtent l="0" t="0" r="0" b="0"/>
+            <wp:wrapTight wrapText="bothSides">
+              <wp:wrapPolygon edited="0">
+                <wp:start x="16024" y="0"/>
+                <wp:lineTo x="0" y="4091"/>
+                <wp:lineTo x="0" y="19636"/>
+                <wp:lineTo x="14488" y="20455"/>
+                <wp:lineTo x="15366" y="20455"/>
+                <wp:lineTo x="21293" y="15545"/>
+                <wp:lineTo x="21293" y="12273"/>
+                <wp:lineTo x="16902" y="0"/>
+                <wp:lineTo x="16024" y="0"/>
+              </wp:wrapPolygon>
+            </wp:wrapTight>
+            <wp:docPr id="1998939437" name="Picture 12">
+              <a:extLst xmlns:a="http://schemas.openxmlformats.org/drawingml/2006/main">
+                <a:ext uri="{FF2B5EF4-FFF2-40B4-BE49-F238E27FC236}">
+                  <a16:creationId xmlns:a16="http://schemas.microsoft.com/office/drawing/2014/main" id="{6DE4EE44-2882-ECBC-7530-F9652EE7C7B3}"/>
+                </a:ext>
+              </a:extLst>
+            </wp:docPr>
+            <wp:cNvGraphicFramePr>
+              <a:graphicFrameLocks xmlns:a="http://schemas.openxmlformats.org/drawingml/2006/main" noChangeAspect="1"/>
+            </wp:cNvGraphicFramePr>
+            <a:graphic xmlns:a="http://schemas.openxmlformats.org/drawingml/2006/main">
+              <a:graphicData uri="http://schemas.openxmlformats.org/drawingml/2006/picture">
+                <pic:pic xmlns:pic="http://schemas.openxmlformats.org/drawingml/2006/picture">
+                  <pic:nvPicPr>
+                    <pic:cNvPr id="13" name="Picture 12">
+                      <a:extLst>
+                        <a:ext uri="{FF2B5EF4-FFF2-40B4-BE49-F238E27FC236}">
+                          <a16:creationId xmlns:a16="http://schemas.microsoft.com/office/drawing/2014/main" id="{6DE4EE44-2882-ECBC-7530-F9652EE7C7B3}"/>
+                        </a:ext>
+                      </a:extLst>
+                    </pic:cNvPr>
+                    <pic:cNvPicPr>
+                      <a:picLocks noChangeAspect="1"/>
+                    </pic:cNvPicPr>
+                  </pic:nvPicPr>
+                  <pic:blipFill>
+                    <a:blip r:embed="rId8" r:link="rId9">
+                      <a:extLst>
+                        <a:ext uri="{28A0092B-C50C-407E-A947-70E740481C1C}">
+                          <a14:useLocalDpi xmlns:a14="http://schemas.microsoft.com/office/drawing/2010/main" val="0"/>
+                        </a:ext>
+                      </a:extLst>
+                    </a:blip>
+                    <a:srcRect/>
+                    <a:stretch>
+                      <a:fillRect/>
+                    </a:stretch>
+                  </pic:blipFill>
+                  <pic:spPr bwMode="auto">
+                    <a:xfrm>
+                      <a:off x="0" y="0"/>
+                      <a:ext cx="1874520" cy="502920"/>
+                    </a:xfrm>
+                    <a:prstGeom prst="rect">
+                      <a:avLst/>
+                    </a:prstGeom>
+                    <a:noFill/>
+                    <a:ln>
+                      <a:noFill/>
+                    </a:ln>
+                  </pic:spPr>
+                </pic:pic>
+              </a:graphicData>
+            </a:graphic>
+          </wp:anchor>
+        </w:drawing>
+      </w:r>
+      <w:bookmarkEnd w:id="0"/>
+    </w:p>
+    <w:p>
+      <w:pPr>
+        <w:pStyle w:val="Heading1"/>
+        <w:jc w:val="center"/>
+        <w:rPr>
+          <w:color w:val="auto"/>
+        </w:rPr>
+      </w:pPr>
+      <w:bookmarkStart w:id="1" w:name="_Toc228368033"/>
       <w:r>
         <w:rPr>
           <w:color w:val="auto"/>
         </w:rPr>
         <w:t>SALES DATA ANALYSIS REPORT</w:t>
       </w:r>
+      <w:bookmarkEnd w:id="1"/>
     </w:p>
     <w:p>
       <w:pPr>
+        <w:jc w:val="center"/>
         <w:rPr>
           <w:sz w:val="36"/>
           <w:szCs w:val="36"/>
@@ -35,10 +135,980 @@
           <w:sz w:val="36"/>
           <w:szCs w:val="36"/>
         </w:rPr>
-        <w:t>, 2026</w:t>
+        <w:t xml:space="preserve"> - </w:t>
+      </w:r>
+      <w:r>
+        <w:rPr>
+          <w:sz w:val="36"/>
+          <w:szCs w:val="36"/>
+        </w:rPr>
+        <w:t>2026</w:t>
       </w:r>
     </w:p>
-    <w:p/>
+    <w:sdt>
+      <w:sdtPr>
+        <w:rPr>
+          <w:lang w:val="en-GB"/>
+        </w:rPr>
+        <w:id w:val="1091892714"/>
+        <w:docPartObj>
+          <w:docPartGallery w:val="Table of Contents"/>
+          <w:docPartUnique/>
+        </w:docPartObj>
+      </w:sdtPr>
+      <w:sdtEndPr>
+        <w:rPr>
+          <w:rFonts w:asciiTheme="minorHAnsi" w:eastAsiaTheme="minorHAnsi" w:hAnsiTheme="minorHAnsi" w:cstheme="minorBidi"/>
+          <w:b/>
+          <w:bCs/>
+          <w:color w:val="auto"/>
+          <w:kern w:val="2"/>
+          <w:sz w:val="24"/>
+          <w:szCs w:val="24"/>
+          <w:lang w:eastAsia="en-US"/>
+          <w14:ligatures w14:val="standardContextual"/>
+        </w:rPr>
+      </w:sdtEndPr>
+      <w:sdtContent>
+        <w:p>
+          <w:pPr>
+            <w:pStyle w:val="TOCHeading"/>
+            <w:rPr>
+              <w:color w:val="auto"/>
+            </w:rPr>
+          </w:pPr>
+          <w:r>
+            <w:rPr>
+              <w:color w:val="auto"/>
+              <w:lang w:val="en-GB"/>
+            </w:rPr>
+            <w:t>Contents</w:t>
+          </w:r>
+        </w:p>
+        <w:p>
+          <w:pPr>
+            <w:pStyle w:val="TOC1"/>
+            <w:tabs>
+              <w:tab w:val="right" w:leader="dot" w:pos="9016"/>
+            </w:tabs>
+            <w:rPr>
+              <w:rFonts w:eastAsiaTheme="minorEastAsia"/>
+              <w:noProof/>
+              <w:lang w:eastAsia="en-ZA"/>
+            </w:rPr>
+          </w:pPr>
+          <w:r>
+            <w:fldChar w:fldCharType="begin"/>
+          </w:r>
+          <w:r>
+            <w:instrText xml:space="preserve"> TOC \o "1-3" \h \z \u </w:instrText>
+          </w:r>
+          <w:r>
+            <w:fldChar w:fldCharType="separate"/>
+          </w:r>
+          <w:hyperlink w:anchor="_Toc228368032" w:history="1">
+            <w:r>
+              <w:rPr>
+                <w:noProof/>
+                <w:webHidden/>
+              </w:rPr>
+              <w:tab/>
+            </w:r>
+            <w:r>
+              <w:rPr>
+                <w:noProof/>
+                <w:webHidden/>
+              </w:rPr>
+              <w:fldChar w:fldCharType="begin"/>
+            </w:r>
+            <w:r>
+              <w:rPr>
+                <w:noProof/>
+                <w:webHidden/>
+              </w:rPr>
+              <w:instrText xml:space="preserve"> PAGEREF _Toc228368032 \h </w:instrText>
+            </w:r>
+            <w:r>
+              <w:rPr>
+                <w:noProof/>
+                <w:webHidden/>
+              </w:rPr>
+            </w:r>
+            <w:r>
+              <w:rPr>
+                <w:noProof/>
+                <w:webHidden/>
+              </w:rPr>
+              <w:fldChar w:fldCharType="separate"/>
+            </w:r>
+            <w:r>
+              <w:rPr>
+                <w:noProof/>
+                <w:webHidden/>
+              </w:rPr>
+              <w:t>1</w:t>
+            </w:r>
+            <w:r>
+              <w:rPr>
+                <w:noProof/>
+                <w:webHidden/>
+              </w:rPr>
+              <w:fldChar w:fldCharType="end"/>
+            </w:r>
+          </w:hyperlink>
+        </w:p>
+        <w:p>
+          <w:pPr>
+            <w:pStyle w:val="TOC1"/>
+            <w:tabs>
+              <w:tab w:val="right" w:leader="dot" w:pos="9016"/>
+            </w:tabs>
+            <w:rPr>
+              <w:rFonts w:eastAsiaTheme="minorEastAsia"/>
+              <w:noProof/>
+              <w:lang w:eastAsia="en-ZA"/>
+            </w:rPr>
+          </w:pPr>
+          <w:hyperlink w:anchor="_Toc228368033" w:history="1">
+            <w:r>
+              <w:rPr>
+                <w:rStyle w:val="Hyperlink"/>
+                <w:noProof/>
+              </w:rPr>
+              <w:t>SALES DATA ANALYSIS REPORT</w:t>
+            </w:r>
+            <w:r>
+              <w:rPr>
+                <w:noProof/>
+                <w:webHidden/>
+              </w:rPr>
+              <w:tab/>
+            </w:r>
+            <w:r>
+              <w:rPr>
+                <w:noProof/>
+                <w:webHidden/>
+              </w:rPr>
+              <w:fldChar w:fldCharType="begin"/>
+            </w:r>
+            <w:r>
+              <w:rPr>
+                <w:noProof/>
+                <w:webHidden/>
+              </w:rPr>
+              <w:instrText xml:space="preserve"> PAGEREF _Toc228368033 \h </w:instrText>
+            </w:r>
+            <w:r>
+              <w:rPr>
+                <w:noProof/>
+                <w:webHidden/>
+              </w:rPr>
+            </w:r>
+            <w:r>
+              <w:rPr>
+                <w:noProof/>
+                <w:webHidden/>
+              </w:rPr>
+              <w:fldChar w:fldCharType="separate"/>
+            </w:r>
+            <w:r>
+              <w:rPr>
+                <w:noProof/>
+                <w:webHidden/>
+              </w:rPr>
+              <w:t>1</w:t>
+            </w:r>
+            <w:r>
+              <w:rPr>
+                <w:noProof/>
+                <w:webHidden/>
+              </w:rPr>
+              <w:fldChar w:fldCharType="end"/>
+            </w:r>
+          </w:hyperlink>
+        </w:p>
+        <w:p>
+          <w:pPr>
+            <w:pStyle w:val="TOC2"/>
+            <w:tabs>
+              <w:tab w:val="right" w:leader="dot" w:pos="9016"/>
+            </w:tabs>
+            <w:rPr>
+              <w:rFonts w:eastAsiaTheme="minorEastAsia"/>
+              <w:noProof/>
+              <w:lang w:eastAsia="en-ZA"/>
+            </w:rPr>
+          </w:pPr>
+          <w:hyperlink w:anchor="_Toc228368034" w:history="1">
+            <w:r>
+              <w:rPr>
+                <w:rStyle w:val="Hyperlink"/>
+                <w:noProof/>
+              </w:rPr>
+              <w:t>1. Introduction</w:t>
+            </w:r>
+            <w:r>
+              <w:rPr>
+                <w:noProof/>
+                <w:webHidden/>
+              </w:rPr>
+              <w:tab/>
+            </w:r>
+            <w:r>
+              <w:rPr>
+                <w:noProof/>
+                <w:webHidden/>
+              </w:rPr>
+              <w:fldChar w:fldCharType="begin"/>
+            </w:r>
+            <w:r>
+              <w:rPr>
+                <w:noProof/>
+                <w:webHidden/>
+              </w:rPr>
+              <w:instrText xml:space="preserve"> PAGEREF _Toc228368034 \h </w:instrText>
+            </w:r>
+            <w:r>
+              <w:rPr>
+                <w:noProof/>
+                <w:webHidden/>
+              </w:rPr>
+            </w:r>
+            <w:r>
+              <w:rPr>
+                <w:noProof/>
+                <w:webHidden/>
+              </w:rPr>
+              <w:fldChar w:fldCharType="separate"/>
+            </w:r>
+            <w:r>
+              <w:rPr>
+                <w:noProof/>
+                <w:webHidden/>
+              </w:rPr>
+              <w:t>1</w:t>
+            </w:r>
+            <w:r>
+              <w:rPr>
+                <w:noProof/>
+                <w:webHidden/>
+              </w:rPr>
+              <w:fldChar w:fldCharType="end"/>
+            </w:r>
+          </w:hyperlink>
+        </w:p>
+        <w:p>
+          <w:pPr>
+            <w:pStyle w:val="TOC2"/>
+            <w:tabs>
+              <w:tab w:val="right" w:leader="dot" w:pos="9016"/>
+            </w:tabs>
+            <w:rPr>
+              <w:rFonts w:eastAsiaTheme="minorEastAsia"/>
+              <w:noProof/>
+              <w:lang w:eastAsia="en-ZA"/>
+            </w:rPr>
+          </w:pPr>
+          <w:hyperlink w:anchor="_Toc228368035" w:history="1">
+            <w:r>
+              <w:rPr>
+                <w:rStyle w:val="Hyperlink"/>
+                <w:noProof/>
+              </w:rPr>
+              <w:t>2. Data Overview</w:t>
+            </w:r>
+            <w:r>
+              <w:rPr>
+                <w:noProof/>
+                <w:webHidden/>
+              </w:rPr>
+              <w:tab/>
+            </w:r>
+            <w:r>
+              <w:rPr>
+                <w:noProof/>
+                <w:webHidden/>
+              </w:rPr>
+              <w:fldChar w:fldCharType="begin"/>
+            </w:r>
+            <w:r>
+              <w:rPr>
+                <w:noProof/>
+                <w:webHidden/>
+              </w:rPr>
+              <w:instrText xml:space="preserve"> PAGEREF _Toc228368035 \h </w:instrText>
+            </w:r>
+            <w:r>
+              <w:rPr>
+                <w:noProof/>
+                <w:webHidden/>
+              </w:rPr>
+            </w:r>
+            <w:r>
+              <w:rPr>
+                <w:noProof/>
+                <w:webHidden/>
+              </w:rPr>
+              <w:fldChar w:fldCharType="separate"/>
+            </w:r>
+            <w:r>
+              <w:rPr>
+                <w:noProof/>
+                <w:webHidden/>
+              </w:rPr>
+              <w:t>1</w:t>
+            </w:r>
+            <w:r>
+              <w:rPr>
+                <w:noProof/>
+                <w:webHidden/>
+              </w:rPr>
+              <w:fldChar w:fldCharType="end"/>
+            </w:r>
+          </w:hyperlink>
+        </w:p>
+        <w:p>
+          <w:pPr>
+            <w:pStyle w:val="TOC2"/>
+            <w:tabs>
+              <w:tab w:val="right" w:leader="dot" w:pos="9016"/>
+            </w:tabs>
+            <w:rPr>
+              <w:rFonts w:eastAsiaTheme="minorEastAsia"/>
+              <w:noProof/>
+              <w:lang w:eastAsia="en-ZA"/>
+            </w:rPr>
+          </w:pPr>
+          <w:hyperlink w:anchor="_Toc228368036" w:history="1">
+            <w:r>
+              <w:rPr>
+                <w:rStyle w:val="Hyperlink"/>
+                <w:noProof/>
+              </w:rPr>
+              <w:t>3. Business Analysis</w:t>
+            </w:r>
+            <w:r>
+              <w:rPr>
+                <w:noProof/>
+                <w:webHidden/>
+              </w:rPr>
+              <w:tab/>
+            </w:r>
+            <w:r>
+              <w:rPr>
+                <w:noProof/>
+                <w:webHidden/>
+              </w:rPr>
+              <w:fldChar w:fldCharType="begin"/>
+            </w:r>
+            <w:r>
+              <w:rPr>
+                <w:noProof/>
+                <w:webHidden/>
+              </w:rPr>
+              <w:instrText xml:space="preserve"> PAGEREF _Toc228368036 \h </w:instrText>
+            </w:r>
+            <w:r>
+              <w:rPr>
+                <w:noProof/>
+                <w:webHidden/>
+              </w:rPr>
+            </w:r>
+            <w:r>
+              <w:rPr>
+                <w:noProof/>
+                <w:webHidden/>
+              </w:rPr>
+              <w:fldChar w:fldCharType="separate"/>
+            </w:r>
+            <w:r>
+              <w:rPr>
+                <w:noProof/>
+                <w:webHidden/>
+              </w:rPr>
+              <w:t>2</w:t>
+            </w:r>
+            <w:r>
+              <w:rPr>
+                <w:noProof/>
+                <w:webHidden/>
+              </w:rPr>
+              <w:fldChar w:fldCharType="end"/>
+            </w:r>
+          </w:hyperlink>
+        </w:p>
+        <w:p>
+          <w:pPr>
+            <w:pStyle w:val="TOC3"/>
+            <w:tabs>
+              <w:tab w:val="right" w:leader="dot" w:pos="9016"/>
+            </w:tabs>
+            <w:rPr>
+              <w:rFonts w:eastAsiaTheme="minorEastAsia"/>
+              <w:noProof/>
+              <w:lang w:eastAsia="en-ZA"/>
+            </w:rPr>
+          </w:pPr>
+          <w:hyperlink w:anchor="_Toc228368037" w:history="1">
+            <w:r>
+              <w:rPr>
+                <w:rStyle w:val="Hyperlink"/>
+                <w:noProof/>
+              </w:rPr>
+              <w:t>Top Performing Region</w:t>
+            </w:r>
+            <w:r>
+              <w:rPr>
+                <w:noProof/>
+                <w:webHidden/>
+              </w:rPr>
+              <w:tab/>
+            </w:r>
+            <w:r>
+              <w:rPr>
+                <w:noProof/>
+                <w:webHidden/>
+              </w:rPr>
+              <w:fldChar w:fldCharType="begin"/>
+            </w:r>
+            <w:r>
+              <w:rPr>
+                <w:noProof/>
+                <w:webHidden/>
+              </w:rPr>
+              <w:instrText xml:space="preserve"> PAGEREF _Toc228368037 \h </w:instrText>
+            </w:r>
+            <w:r>
+              <w:rPr>
+                <w:noProof/>
+                <w:webHidden/>
+              </w:rPr>
+            </w:r>
+            <w:r>
+              <w:rPr>
+                <w:noProof/>
+                <w:webHidden/>
+              </w:rPr>
+              <w:fldChar w:fldCharType="separate"/>
+            </w:r>
+            <w:r>
+              <w:rPr>
+                <w:noProof/>
+                <w:webHidden/>
+              </w:rPr>
+              <w:t>2</w:t>
+            </w:r>
+            <w:r>
+              <w:rPr>
+                <w:noProof/>
+                <w:webHidden/>
+              </w:rPr>
+              <w:fldChar w:fldCharType="end"/>
+            </w:r>
+          </w:hyperlink>
+        </w:p>
+        <w:p>
+          <w:pPr>
+            <w:pStyle w:val="TOC3"/>
+            <w:tabs>
+              <w:tab w:val="right" w:leader="dot" w:pos="9016"/>
+            </w:tabs>
+            <w:rPr>
+              <w:rFonts w:eastAsiaTheme="minorEastAsia"/>
+              <w:noProof/>
+              <w:lang w:eastAsia="en-ZA"/>
+            </w:rPr>
+          </w:pPr>
+          <w:hyperlink w:anchor="_Toc228368038" w:history="1">
+            <w:r>
+              <w:rPr>
+                <w:rStyle w:val="Hyperlink"/>
+                <w:noProof/>
+              </w:rPr>
+              <w:t>Highest revenue-generating products</w:t>
+            </w:r>
+            <w:r>
+              <w:rPr>
+                <w:noProof/>
+                <w:webHidden/>
+              </w:rPr>
+              <w:tab/>
+            </w:r>
+            <w:r>
+              <w:rPr>
+                <w:noProof/>
+                <w:webHidden/>
+              </w:rPr>
+              <w:fldChar w:fldCharType="begin"/>
+            </w:r>
+            <w:r>
+              <w:rPr>
+                <w:noProof/>
+                <w:webHidden/>
+              </w:rPr>
+              <w:instrText xml:space="preserve"> PAGEREF _Toc228368038 \h </w:instrText>
+            </w:r>
+            <w:r>
+              <w:rPr>
+                <w:noProof/>
+                <w:webHidden/>
+              </w:rPr>
+            </w:r>
+            <w:r>
+              <w:rPr>
+                <w:noProof/>
+                <w:webHidden/>
+              </w:rPr>
+              <w:fldChar w:fldCharType="separate"/>
+            </w:r>
+            <w:r>
+              <w:rPr>
+                <w:noProof/>
+                <w:webHidden/>
+              </w:rPr>
+              <w:t>2</w:t>
+            </w:r>
+            <w:r>
+              <w:rPr>
+                <w:noProof/>
+                <w:webHidden/>
+              </w:rPr>
+              <w:fldChar w:fldCharType="end"/>
+            </w:r>
+          </w:hyperlink>
+        </w:p>
+        <w:p>
+          <w:pPr>
+            <w:pStyle w:val="TOC3"/>
+            <w:tabs>
+              <w:tab w:val="right" w:leader="dot" w:pos="9016"/>
+            </w:tabs>
+            <w:rPr>
+              <w:rFonts w:eastAsiaTheme="minorEastAsia"/>
+              <w:noProof/>
+              <w:lang w:eastAsia="en-ZA"/>
+            </w:rPr>
+          </w:pPr>
+          <w:hyperlink w:anchor="_Toc228368039" w:history="1">
+            <w:r>
+              <w:rPr>
+                <w:rStyle w:val="Hyperlink"/>
+                <w:noProof/>
+              </w:rPr>
+              <w:t>Sales Trends Over Time</w:t>
+            </w:r>
+            <w:r>
+              <w:rPr>
+                <w:noProof/>
+                <w:webHidden/>
+              </w:rPr>
+              <w:tab/>
+            </w:r>
+            <w:r>
+              <w:rPr>
+                <w:noProof/>
+                <w:webHidden/>
+              </w:rPr>
+              <w:fldChar w:fldCharType="begin"/>
+            </w:r>
+            <w:r>
+              <w:rPr>
+                <w:noProof/>
+                <w:webHidden/>
+              </w:rPr>
+              <w:instrText xml:space="preserve"> PAGEREF _Toc228368039 \h </w:instrText>
+            </w:r>
+            <w:r>
+              <w:rPr>
+                <w:noProof/>
+                <w:webHidden/>
+              </w:rPr>
+            </w:r>
+            <w:r>
+              <w:rPr>
+                <w:noProof/>
+                <w:webHidden/>
+              </w:rPr>
+              <w:fldChar w:fldCharType="separate"/>
+            </w:r>
+            <w:r>
+              <w:rPr>
+                <w:noProof/>
+                <w:webHidden/>
+              </w:rPr>
+              <w:t>3</w:t>
+            </w:r>
+            <w:r>
+              <w:rPr>
+                <w:noProof/>
+                <w:webHidden/>
+              </w:rPr>
+              <w:fldChar w:fldCharType="end"/>
+            </w:r>
+          </w:hyperlink>
+        </w:p>
+        <w:p>
+          <w:pPr>
+            <w:pStyle w:val="TOC3"/>
+            <w:tabs>
+              <w:tab w:val="right" w:leader="dot" w:pos="9016"/>
+            </w:tabs>
+            <w:rPr>
+              <w:rFonts w:eastAsiaTheme="minorEastAsia"/>
+              <w:noProof/>
+              <w:lang w:eastAsia="en-ZA"/>
+            </w:rPr>
+          </w:pPr>
+          <w:hyperlink w:anchor="_Toc228368040" w:history="1">
+            <w:r>
+              <w:rPr>
+                <w:rStyle w:val="Hyperlink"/>
+                <w:noProof/>
+              </w:rPr>
+              <w:t>Top-performing Salespeople</w:t>
+            </w:r>
+            <w:r>
+              <w:rPr>
+                <w:noProof/>
+                <w:webHidden/>
+              </w:rPr>
+              <w:tab/>
+            </w:r>
+            <w:r>
+              <w:rPr>
+                <w:noProof/>
+                <w:webHidden/>
+              </w:rPr>
+              <w:fldChar w:fldCharType="begin"/>
+            </w:r>
+            <w:r>
+              <w:rPr>
+                <w:noProof/>
+                <w:webHidden/>
+              </w:rPr>
+              <w:instrText xml:space="preserve"> PAGEREF _Toc228368040 \h </w:instrText>
+            </w:r>
+            <w:r>
+              <w:rPr>
+                <w:noProof/>
+                <w:webHidden/>
+              </w:rPr>
+            </w:r>
+            <w:r>
+              <w:rPr>
+                <w:noProof/>
+                <w:webHidden/>
+              </w:rPr>
+              <w:fldChar w:fldCharType="separate"/>
+            </w:r>
+            <w:r>
+              <w:rPr>
+                <w:noProof/>
+                <w:webHidden/>
+              </w:rPr>
+              <w:t>3</w:t>
+            </w:r>
+            <w:r>
+              <w:rPr>
+                <w:noProof/>
+                <w:webHidden/>
+              </w:rPr>
+              <w:fldChar w:fldCharType="end"/>
+            </w:r>
+          </w:hyperlink>
+        </w:p>
+        <w:p>
+          <w:pPr>
+            <w:pStyle w:val="TOC2"/>
+            <w:tabs>
+              <w:tab w:val="right" w:leader="dot" w:pos="9016"/>
+            </w:tabs>
+            <w:rPr>
+              <w:rFonts w:eastAsiaTheme="minorEastAsia"/>
+              <w:noProof/>
+              <w:lang w:eastAsia="en-ZA"/>
+            </w:rPr>
+          </w:pPr>
+          <w:hyperlink w:anchor="_Toc228368041" w:history="1">
+            <w:r>
+              <w:rPr>
+                <w:rStyle w:val="Hyperlink"/>
+                <w:noProof/>
+              </w:rPr>
+              <w:t>4. Recommendations</w:t>
+            </w:r>
+            <w:r>
+              <w:rPr>
+                <w:noProof/>
+                <w:webHidden/>
+              </w:rPr>
+              <w:tab/>
+            </w:r>
+            <w:r>
+              <w:rPr>
+                <w:noProof/>
+                <w:webHidden/>
+              </w:rPr>
+              <w:fldChar w:fldCharType="begin"/>
+            </w:r>
+            <w:r>
+              <w:rPr>
+                <w:noProof/>
+                <w:webHidden/>
+              </w:rPr>
+              <w:instrText xml:space="preserve"> PAGEREF _Toc228368041 \h </w:instrText>
+            </w:r>
+            <w:r>
+              <w:rPr>
+                <w:noProof/>
+                <w:webHidden/>
+              </w:rPr>
+            </w:r>
+            <w:r>
+              <w:rPr>
+                <w:noProof/>
+                <w:webHidden/>
+              </w:rPr>
+              <w:fldChar w:fldCharType="separate"/>
+            </w:r>
+            <w:r>
+              <w:rPr>
+                <w:noProof/>
+                <w:webHidden/>
+              </w:rPr>
+              <w:t>4</w:t>
+            </w:r>
+            <w:r>
+              <w:rPr>
+                <w:noProof/>
+                <w:webHidden/>
+              </w:rPr>
+              <w:fldChar w:fldCharType="end"/>
+            </w:r>
+          </w:hyperlink>
+        </w:p>
+        <w:p>
+          <w:pPr>
+            <w:pStyle w:val="TOC3"/>
+            <w:tabs>
+              <w:tab w:val="right" w:leader="dot" w:pos="9016"/>
+            </w:tabs>
+            <w:rPr>
+              <w:rFonts w:eastAsiaTheme="minorEastAsia"/>
+              <w:noProof/>
+              <w:lang w:eastAsia="en-ZA"/>
+            </w:rPr>
+          </w:pPr>
+          <w:hyperlink w:anchor="_Toc228368042" w:history="1">
+            <w:r>
+              <w:rPr>
+                <w:rStyle w:val="Hyperlink"/>
+                <w:noProof/>
+              </w:rPr>
+              <w:t>1. Focus on High-Performing Products</w:t>
+            </w:r>
+            <w:r>
+              <w:rPr>
+                <w:noProof/>
+                <w:webHidden/>
+              </w:rPr>
+              <w:tab/>
+            </w:r>
+            <w:r>
+              <w:rPr>
+                <w:noProof/>
+                <w:webHidden/>
+              </w:rPr>
+              <w:fldChar w:fldCharType="begin"/>
+            </w:r>
+            <w:r>
+              <w:rPr>
+                <w:noProof/>
+                <w:webHidden/>
+              </w:rPr>
+              <w:instrText xml:space="preserve"> PAGEREF _Toc228368042 \h </w:instrText>
+            </w:r>
+            <w:r>
+              <w:rPr>
+                <w:noProof/>
+                <w:webHidden/>
+              </w:rPr>
+            </w:r>
+            <w:r>
+              <w:rPr>
+                <w:noProof/>
+                <w:webHidden/>
+              </w:rPr>
+              <w:fldChar w:fldCharType="separate"/>
+            </w:r>
+            <w:r>
+              <w:rPr>
+                <w:noProof/>
+                <w:webHidden/>
+              </w:rPr>
+              <w:t>4</w:t>
+            </w:r>
+            <w:r>
+              <w:rPr>
+                <w:noProof/>
+                <w:webHidden/>
+              </w:rPr>
+              <w:fldChar w:fldCharType="end"/>
+            </w:r>
+          </w:hyperlink>
+        </w:p>
+        <w:p>
+          <w:pPr>
+            <w:pStyle w:val="TOC3"/>
+            <w:tabs>
+              <w:tab w:val="right" w:leader="dot" w:pos="9016"/>
+            </w:tabs>
+            <w:rPr>
+              <w:rFonts w:eastAsiaTheme="minorEastAsia"/>
+              <w:noProof/>
+              <w:lang w:eastAsia="en-ZA"/>
+            </w:rPr>
+          </w:pPr>
+          <w:hyperlink w:anchor="_Toc228368043" w:history="1">
+            <w:r>
+              <w:rPr>
+                <w:rStyle w:val="Hyperlink"/>
+                <w:noProof/>
+              </w:rPr>
+              <w:t>2. Improve Performance of Lower-Selling Products</w:t>
+            </w:r>
+            <w:r>
+              <w:rPr>
+                <w:noProof/>
+                <w:webHidden/>
+              </w:rPr>
+              <w:tab/>
+            </w:r>
+            <w:r>
+              <w:rPr>
+                <w:noProof/>
+                <w:webHidden/>
+              </w:rPr>
+              <w:fldChar w:fldCharType="begin"/>
+            </w:r>
+            <w:r>
+              <w:rPr>
+                <w:noProof/>
+                <w:webHidden/>
+              </w:rPr>
+              <w:instrText xml:space="preserve"> PAGEREF _Toc228368043 \h </w:instrText>
+            </w:r>
+            <w:r>
+              <w:rPr>
+                <w:noProof/>
+                <w:webHidden/>
+              </w:rPr>
+            </w:r>
+            <w:r>
+              <w:rPr>
+                <w:noProof/>
+                <w:webHidden/>
+              </w:rPr>
+              <w:fldChar w:fldCharType="separate"/>
+            </w:r>
+            <w:r>
+              <w:rPr>
+                <w:noProof/>
+                <w:webHidden/>
+              </w:rPr>
+              <w:t>4</w:t>
+            </w:r>
+            <w:r>
+              <w:rPr>
+                <w:noProof/>
+                <w:webHidden/>
+              </w:rPr>
+              <w:fldChar w:fldCharType="end"/>
+            </w:r>
+          </w:hyperlink>
+        </w:p>
+        <w:p>
+          <w:pPr>
+            <w:pStyle w:val="TOC3"/>
+            <w:tabs>
+              <w:tab w:val="right" w:leader="dot" w:pos="9016"/>
+            </w:tabs>
+            <w:rPr>
+              <w:rFonts w:eastAsiaTheme="minorEastAsia"/>
+              <w:noProof/>
+              <w:lang w:eastAsia="en-ZA"/>
+            </w:rPr>
+          </w:pPr>
+          <w:hyperlink w:anchor="_Toc228368044" w:history="1">
+            <w:r>
+              <w:rPr>
+                <w:rStyle w:val="Hyperlink"/>
+                <w:noProof/>
+              </w:rPr>
+              <w:t>3. Improve Data Quality Controls</w:t>
+            </w:r>
+            <w:r>
+              <w:rPr>
+                <w:noProof/>
+                <w:webHidden/>
+              </w:rPr>
+              <w:tab/>
+            </w:r>
+            <w:r>
+              <w:rPr>
+                <w:noProof/>
+                <w:webHidden/>
+              </w:rPr>
+              <w:fldChar w:fldCharType="begin"/>
+            </w:r>
+            <w:r>
+              <w:rPr>
+                <w:noProof/>
+                <w:webHidden/>
+              </w:rPr>
+              <w:instrText xml:space="preserve"> PAGEREF _Toc228368044 \h </w:instrText>
+            </w:r>
+            <w:r>
+              <w:rPr>
+                <w:noProof/>
+                <w:webHidden/>
+              </w:rPr>
+            </w:r>
+            <w:r>
+              <w:rPr>
+                <w:noProof/>
+                <w:webHidden/>
+              </w:rPr>
+              <w:fldChar w:fldCharType="separate"/>
+            </w:r>
+            <w:r>
+              <w:rPr>
+                <w:noProof/>
+                <w:webHidden/>
+              </w:rPr>
+              <w:t>4</w:t>
+            </w:r>
+            <w:r>
+              <w:rPr>
+                <w:noProof/>
+                <w:webHidden/>
+              </w:rPr>
+              <w:fldChar w:fldCharType="end"/>
+            </w:r>
+          </w:hyperlink>
+        </w:p>
+        <w:p>
+          <w:r>
+            <w:rPr>
+              <w:b/>
+              <w:bCs/>
+              <w:lang w:val="en-GB"/>
+            </w:rPr>
+            <w:fldChar w:fldCharType="end"/>
+          </w:r>
+        </w:p>
+      </w:sdtContent>
+    </w:sdt>
     <w:p>
       <w:pPr>
         <w:pStyle w:val="Heading2"/>
@@ -46,16 +1116,36 @@
           <w:color w:val="auto"/>
         </w:rPr>
       </w:pPr>
+      <w:bookmarkStart w:id="2" w:name="_Toc228368034"/>
       <w:r>
         <w:rPr>
           <w:color w:val="auto"/>
         </w:rPr>
         <w:t>1. Introduction</w:t>
       </w:r>
+      <w:bookmarkEnd w:id="2"/>
     </w:p>
     <w:p>
       <w:r>
-        <w:t>This report analyses retail sales data to understand performance across regions, products, time periods, and salespeople. The data was cleaned and processed using Python, then analysed in Excel using pivot tables and visualisations to identify key business trends. The main goal is to highlight what is driving revenue and provide insights that can support better business decisions.</w:t>
+        <w:t>This report analyses sales data to understand performance across regions, products, time periods, and salespeople. The data was cleaned using Python</w:t>
+      </w:r>
+      <w:r>
+        <w:t xml:space="preserve"> and </w:t>
+      </w:r>
+      <w:r>
+        <w:t>analysed in Excel using pivot tables and visualisations to identify business trends. The main goal is to highlight what driv</w:t>
+      </w:r>
+      <w:r>
+        <w:t>es</w:t>
+      </w:r>
+      <w:r>
+        <w:t xml:space="preserve"> revenue and </w:t>
+      </w:r>
+      <w:r>
+        <w:t>give</w:t>
+      </w:r>
+      <w:r>
+        <w:t xml:space="preserve"> insights that can support business decisions.</w:t>
       </w:r>
     </w:p>
     <w:p/>
@@ -66,19 +1156,26 @@
           <w:color w:val="auto"/>
         </w:rPr>
       </w:pPr>
+      <w:bookmarkStart w:id="3" w:name="_Toc228368035"/>
       <w:r>
         <w:rPr>
           <w:color w:val="auto"/>
         </w:rPr>
         <w:t>2. Data Overview</w:t>
       </w:r>
+      <w:bookmarkEnd w:id="3"/>
     </w:p>
     <w:p>
       <w:r>
-        <w:t>The dataset contains transactional sales records including product details, quantities, prices, regions, and salesperson information. During the cleaning process, missing values and duplicates were identified and addressed. A small number of transactions with missing quantity values were removed, as quantity is required to calculate revenue accurately.</w:t>
+        <w:t>The dataset contains sales records including product details, quantities, prices, regions, and salesperson information. During the cleaning process, missing values and</w:t>
+      </w:r>
+      <w:r>
+        <w:t xml:space="preserve"> </w:t>
+      </w:r>
+      <w:r>
+        <w:t>duplicates were identified and addressed. A small number of transactions with missing quantity values were removed, as quantity is required to calculate revenue accurately.</w:t>
       </w:r>
     </w:p>
-    <w:p/>
     <w:p>
       <w:pPr>
         <w:pStyle w:val="Heading2"/>
@@ -86,26 +1183,82 @@
           <w:color w:val="auto"/>
         </w:rPr>
       </w:pPr>
+      <w:bookmarkStart w:id="4" w:name="_Toc228368036"/>
       <w:r>
         <w:rPr>
           <w:color w:val="auto"/>
         </w:rPr>
+        <w:lastRenderedPageBreak/>
         <w:t>3. Business Analysis</w:t>
       </w:r>
+      <w:bookmarkEnd w:id="4"/>
     </w:p>
     <w:p>
       <w:pPr>
         <w:pStyle w:val="Heading3"/>
       </w:pPr>
+      <w:bookmarkStart w:id="5" w:name="_Toc228368037"/>
       <w:r>
         <w:rPr>
           <w:color w:val="auto"/>
         </w:rPr>
         <w:t>Top Performing Region</w:t>
       </w:r>
+      <w:bookmarkEnd w:id="5"/>
     </w:p>
     <w:p>
       <w:r>
+        <w:drawing>
+          <wp:anchor distT="0" distB="0" distL="114300" distR="114300" simplePos="0" relativeHeight="251660288" behindDoc="0" locked="0" layoutInCell="1" allowOverlap="1" wp14:anchorId="2033533E" wp14:editId="2731735C">
+            <wp:simplePos x="0" y="0"/>
+            <wp:positionH relativeFrom="margin">
+              <wp:align>center</wp:align>
+            </wp:positionH>
+            <wp:positionV relativeFrom="paragraph">
+              <wp:posOffset>1113155</wp:posOffset>
+            </wp:positionV>
+            <wp:extent cx="3839111" cy="2457793"/>
+            <wp:effectExtent l="0" t="0" r="9525" b="0"/>
+            <wp:wrapTopAndBottom/>
+            <wp:docPr id="1365060264" name="Picture 1"/>
+            <wp:cNvGraphicFramePr>
+              <a:graphicFrameLocks xmlns:a="http://schemas.openxmlformats.org/drawingml/2006/main" noChangeAspect="1"/>
+            </wp:cNvGraphicFramePr>
+            <a:graphic xmlns:a="http://schemas.openxmlformats.org/drawingml/2006/main">
+              <a:graphicData uri="http://schemas.openxmlformats.org/drawingml/2006/picture">
+                <pic:pic xmlns:pic="http://schemas.openxmlformats.org/drawingml/2006/picture">
+                  <pic:nvPicPr>
+                    <pic:cNvPr id="1365060264" name=""/>
+                    <pic:cNvPicPr/>
+                  </pic:nvPicPr>
+                  <pic:blipFill>
+                    <a:blip r:embed="rId10">
+                      <a:extLst>
+                        <a:ext uri="{28A0092B-C50C-407E-A947-70E740481C1C}">
+                          <a14:useLocalDpi xmlns:a14="http://schemas.microsoft.com/office/drawing/2010/main" val="0"/>
+                        </a:ext>
+                      </a:extLst>
+                    </a:blip>
+                    <a:stretch>
+                      <a:fillRect/>
+                    </a:stretch>
+                  </pic:blipFill>
+                  <pic:spPr>
+                    <a:xfrm>
+                      <a:off x="0" y="0"/>
+                      <a:ext cx="3839111" cy="2457793"/>
+                    </a:xfrm>
+                    <a:prstGeom prst="rect">
+                      <a:avLst/>
+                    </a:prstGeom>
+                  </pic:spPr>
+                </pic:pic>
+              </a:graphicData>
+            </a:graphic>
+          </wp:anchor>
+        </w:drawing>
+      </w:r>
+      <w:r>
         <w:t>The East Region</w:t>
       </w:r>
       <w:r>
@@ -130,7 +1283,6 @@
         <w:t>regions are clearly doing much better than others. This could be because of higher demand, better sales coverage, or even stronger customer presence in that area.</w:t>
       </w:r>
     </w:p>
-    <w:p/>
     <w:p>
       <w:pPr>
         <w:pStyle w:val="Heading3"/>
@@ -138,31 +1290,7 @@
           <w:color w:val="auto"/>
         </w:rPr>
       </w:pPr>
-      <w:r>
-        <w:rPr>
-          <w:color w:val="auto"/>
-        </w:rPr>
-        <w:t xml:space="preserve">Highest revenue-generating products </w:t>
-      </w:r>
     </w:p>
-    <w:p>
-      <w:r>
-        <w:t>When it comes to products,</w:t>
-      </w:r>
-      <w:r>
-        <w:t xml:space="preserve"> overall, Phones</w:t>
-      </w:r>
-      <w:r>
-        <w:t xml:space="preserve"> are generating the highest revenue</w:t>
-      </w:r>
-      <w:r>
-        <w:t xml:space="preserve"> of R440 000, which is higher than the rest of the products, with laptops following at 180 000 and tablets at 150 000. The remaining products contribute much less with desks at 75 000 and chairs at 58 500. T</w:t>
-      </w:r>
-      <w:r>
-        <w:t>his shows that the business is heavily driven by phone sales.</w:t>
-      </w:r>
-    </w:p>
-    <w:p/>
     <w:p>
       <w:pPr>
         <w:pStyle w:val="Heading3"/>
@@ -170,12 +1298,106 @@
           <w:color w:val="auto"/>
         </w:rPr>
       </w:pPr>
+      <w:bookmarkStart w:id="6" w:name="_Toc228368038"/>
       <w:r>
         <w:rPr>
           <w:color w:val="auto"/>
         </w:rPr>
+        <w:t>Highest revenue-generating products</w:t>
+      </w:r>
+      <w:bookmarkEnd w:id="6"/>
+      <w:r>
+        <w:rPr>
+          <w:color w:val="auto"/>
+        </w:rPr>
+        <w:t xml:space="preserve"> </w:t>
+      </w:r>
+    </w:p>
+    <w:p>
+      <w:r>
+        <w:drawing>
+          <wp:anchor distT="0" distB="0" distL="114300" distR="114300" simplePos="0" relativeHeight="251661312" behindDoc="0" locked="0" layoutInCell="1" allowOverlap="1" wp14:anchorId="6413F03D" wp14:editId="5EC9A54C">
+            <wp:simplePos x="0" y="0"/>
+            <wp:positionH relativeFrom="margin">
+              <wp:align>center</wp:align>
+            </wp:positionH>
+            <wp:positionV relativeFrom="paragraph">
+              <wp:posOffset>1179195</wp:posOffset>
+            </wp:positionV>
+            <wp:extent cx="3953427" cy="2572109"/>
+            <wp:effectExtent l="0" t="0" r="9525" b="0"/>
+            <wp:wrapTopAndBottom/>
+            <wp:docPr id="87628098" name="Picture 1"/>
+            <wp:cNvGraphicFramePr>
+              <a:graphicFrameLocks xmlns:a="http://schemas.openxmlformats.org/drawingml/2006/main" noChangeAspect="1"/>
+            </wp:cNvGraphicFramePr>
+            <a:graphic xmlns:a="http://schemas.openxmlformats.org/drawingml/2006/main">
+              <a:graphicData uri="http://schemas.openxmlformats.org/drawingml/2006/picture">
+                <pic:pic xmlns:pic="http://schemas.openxmlformats.org/drawingml/2006/picture">
+                  <pic:nvPicPr>
+                    <pic:cNvPr id="87628098" name=""/>
+                    <pic:cNvPicPr/>
+                  </pic:nvPicPr>
+                  <pic:blipFill>
+                    <a:blip r:embed="rId11">
+                      <a:extLst>
+                        <a:ext uri="{28A0092B-C50C-407E-A947-70E740481C1C}">
+                          <a14:useLocalDpi xmlns:a14="http://schemas.microsoft.com/office/drawing/2010/main" val="0"/>
+                        </a:ext>
+                      </a:extLst>
+                    </a:blip>
+                    <a:stretch>
+                      <a:fillRect/>
+                    </a:stretch>
+                  </pic:blipFill>
+                  <pic:spPr>
+                    <a:xfrm>
+                      <a:off x="0" y="0"/>
+                      <a:ext cx="3953427" cy="2572109"/>
+                    </a:xfrm>
+                    <a:prstGeom prst="rect">
+                      <a:avLst/>
+                    </a:prstGeom>
+                  </pic:spPr>
+                </pic:pic>
+              </a:graphicData>
+            </a:graphic>
+          </wp:anchor>
+        </w:drawing>
+      </w:r>
+      <w:r>
+        <w:t>When it comes to products,</w:t>
+      </w:r>
+      <w:r>
+        <w:t xml:space="preserve"> overall, Phones</w:t>
+      </w:r>
+      <w:r>
+        <w:t xml:space="preserve"> are generating the highest revenue</w:t>
+      </w:r>
+      <w:r>
+        <w:t xml:space="preserve"> of R440 000, which is higher than the rest of the products, with laptops following at 180 000 and tablets at 150 000. The remaining products contribute much less with desks at 75 000 and chairs at 58 500. T</w:t>
+      </w:r>
+      <w:r>
+        <w:t>his shows that the business is heavily driven by phone sales.</w:t>
+      </w:r>
+    </w:p>
+    <w:p/>
+    <w:p>
+      <w:pPr>
+        <w:pStyle w:val="Heading3"/>
+        <w:rPr>
+          <w:color w:val="auto"/>
+        </w:rPr>
+      </w:pPr>
+      <w:bookmarkStart w:id="7" w:name="_Toc228368039"/>
+      <w:r>
+        <w:rPr>
+          <w:color w:val="auto"/>
+        </w:rPr>
+        <w:lastRenderedPageBreak/>
         <w:t>Sales Trends Over Time</w:t>
       </w:r>
+      <w:bookmarkEnd w:id="7"/>
     </w:p>
     <w:p>
       <w:pPr>
@@ -185,6 +1407,57 @@
         </w:rPr>
       </w:pPr>
       <w:r>
+        <w:drawing>
+          <wp:anchor distT="0" distB="0" distL="114300" distR="114300" simplePos="0" relativeHeight="251662336" behindDoc="0" locked="0" layoutInCell="1" allowOverlap="1" wp14:anchorId="77FFE123" wp14:editId="5E95F9B7">
+            <wp:simplePos x="0" y="0"/>
+            <wp:positionH relativeFrom="margin">
+              <wp:align>center</wp:align>
+            </wp:positionH>
+            <wp:positionV relativeFrom="paragraph">
+              <wp:posOffset>1640840</wp:posOffset>
+            </wp:positionV>
+            <wp:extent cx="3953427" cy="2581635"/>
+            <wp:effectExtent l="0" t="0" r="9525" b="9525"/>
+            <wp:wrapTopAndBottom/>
+            <wp:docPr id="1346819519" name="Picture 1"/>
+            <wp:cNvGraphicFramePr>
+              <a:graphicFrameLocks xmlns:a="http://schemas.openxmlformats.org/drawingml/2006/main" noChangeAspect="1"/>
+            </wp:cNvGraphicFramePr>
+            <a:graphic xmlns:a="http://schemas.openxmlformats.org/drawingml/2006/main">
+              <a:graphicData uri="http://schemas.openxmlformats.org/drawingml/2006/picture">
+                <pic:pic xmlns:pic="http://schemas.openxmlformats.org/drawingml/2006/picture">
+                  <pic:nvPicPr>
+                    <pic:cNvPr id="1346819519" name=""/>
+                    <pic:cNvPicPr/>
+                  </pic:nvPicPr>
+                  <pic:blipFill>
+                    <a:blip r:embed="rId12">
+                      <a:extLst>
+                        <a:ext uri="{28A0092B-C50C-407E-A947-70E740481C1C}">
+                          <a14:useLocalDpi xmlns:a14="http://schemas.microsoft.com/office/drawing/2010/main" val="0"/>
+                        </a:ext>
+                      </a:extLst>
+                    </a:blip>
+                    <a:stretch>
+                      <a:fillRect/>
+                    </a:stretch>
+                  </pic:blipFill>
+                  <pic:spPr>
+                    <a:xfrm>
+                      <a:off x="0" y="0"/>
+                      <a:ext cx="3953427" cy="2581635"/>
+                    </a:xfrm>
+                    <a:prstGeom prst="rect">
+                      <a:avLst/>
+                    </a:prstGeom>
+                  </pic:spPr>
+                </pic:pic>
+              </a:graphicData>
+            </a:graphic>
+          </wp:anchor>
+        </w:drawing>
+      </w:r>
+      <w:r>
         <w:t>Looking at the monthly revenue, there’s a clear upward trend from January to March. Sales start at around 160</w:t>
       </w:r>
       <w:r>
@@ -232,15 +1505,68 @@
       <w:pPr>
         <w:pStyle w:val="Heading3"/>
       </w:pPr>
+      <w:bookmarkStart w:id="8" w:name="_Toc228368040"/>
       <w:r>
         <w:rPr>
           <w:color w:val="auto"/>
         </w:rPr>
         <w:t>Top-performing Salespeople</w:t>
       </w:r>
+      <w:bookmarkEnd w:id="8"/>
     </w:p>
     <w:p>
       <w:r>
+        <w:drawing>
+          <wp:anchor distT="0" distB="0" distL="114300" distR="114300" simplePos="0" relativeHeight="251663360" behindDoc="0" locked="0" layoutInCell="1" allowOverlap="1" wp14:anchorId="0027015E" wp14:editId="7E7191CD">
+            <wp:simplePos x="0" y="0"/>
+            <wp:positionH relativeFrom="margin">
+              <wp:align>center</wp:align>
+            </wp:positionH>
+            <wp:positionV relativeFrom="paragraph">
+              <wp:posOffset>1171575</wp:posOffset>
+            </wp:positionV>
+            <wp:extent cx="2067213" cy="1324160"/>
+            <wp:effectExtent l="0" t="0" r="0" b="9525"/>
+            <wp:wrapTopAndBottom/>
+            <wp:docPr id="2072370442" name="Picture 1"/>
+            <wp:cNvGraphicFramePr>
+              <a:graphicFrameLocks xmlns:a="http://schemas.openxmlformats.org/drawingml/2006/main" noChangeAspect="1"/>
+            </wp:cNvGraphicFramePr>
+            <a:graphic xmlns:a="http://schemas.openxmlformats.org/drawingml/2006/main">
+              <a:graphicData uri="http://schemas.openxmlformats.org/drawingml/2006/picture">
+                <pic:pic xmlns:pic="http://schemas.openxmlformats.org/drawingml/2006/picture">
+                  <pic:nvPicPr>
+                    <pic:cNvPr id="2072370442" name=""/>
+                    <pic:cNvPicPr/>
+                  </pic:nvPicPr>
+                  <pic:blipFill>
+                    <a:blip r:embed="rId13">
+                      <a:extLst>
+                        <a:ext uri="{28A0092B-C50C-407E-A947-70E740481C1C}">
+                          <a14:useLocalDpi xmlns:a14="http://schemas.microsoft.com/office/drawing/2010/main" val="0"/>
+                        </a:ext>
+                      </a:extLst>
+                    </a:blip>
+                    <a:stretch>
+                      <a:fillRect/>
+                    </a:stretch>
+                  </pic:blipFill>
+                  <pic:spPr>
+                    <a:xfrm>
+                      <a:off x="0" y="0"/>
+                      <a:ext cx="2067213" cy="1324160"/>
+                    </a:xfrm>
+                    <a:prstGeom prst="rect">
+                      <a:avLst/>
+                    </a:prstGeom>
+                  </pic:spPr>
+                </pic:pic>
+              </a:graphicData>
+            </a:graphic>
+          </wp:anchor>
+        </w:drawing>
+      </w:r>
+      <w:r>
         <w:t>There’s also a noticeable difference in how salespeople are performing.</w:t>
       </w:r>
       <w:r>
@@ -260,14 +1586,17 @@
       </w:r>
     </w:p>
     <w:p/>
+    <w:p/>
     <w:p>
       <w:pPr>
         <w:pStyle w:val="Heading2"/>
       </w:pPr>
+      <w:bookmarkStart w:id="9" w:name="_Toc228368041"/>
       <w:r>
         <w:rPr>
           <w:color w:val="auto"/>
         </w:rPr>
+        <w:lastRenderedPageBreak/>
         <w:t>4</w:t>
       </w:r>
       <w:r>
@@ -276,6 +1605,7 @@
         </w:rPr>
         <w:t>. Recommendations</w:t>
       </w:r>
+      <w:bookmarkEnd w:id="9"/>
     </w:p>
     <w:p>
       <w:pPr>
@@ -284,12 +1614,14 @@
           <w:color w:val="auto"/>
         </w:rPr>
       </w:pPr>
+      <w:bookmarkStart w:id="10" w:name="_Toc228368042"/>
       <w:r>
         <w:rPr>
           <w:color w:val="auto"/>
         </w:rPr>
         <w:t>1. Focus on High-Performing Products</w:t>
       </w:r>
+      <w:bookmarkEnd w:id="10"/>
     </w:p>
     <w:p>
       <w:r>
@@ -304,12 +1636,14 @@
           <w:color w:val="auto"/>
         </w:rPr>
       </w:pPr>
+      <w:bookmarkStart w:id="11" w:name="_Toc228368043"/>
       <w:r>
         <w:rPr>
           <w:color w:val="auto"/>
         </w:rPr>
         <w:t>2. Improve Performance of Lower-Selling Products</w:t>
       </w:r>
+      <w:bookmarkEnd w:id="11"/>
     </w:p>
     <w:p>
       <w:r>
@@ -324,6 +1658,7 @@
           <w:color w:val="auto"/>
         </w:rPr>
       </w:pPr>
+      <w:bookmarkStart w:id="12" w:name="_Toc228368044"/>
       <w:r>
         <w:rPr>
           <w:color w:val="auto"/>
@@ -336,6 +1671,7 @@
         </w:rPr>
         <w:t>. Improve Data Quality Controls</w:t>
       </w:r>
+      <w:bookmarkEnd w:id="12"/>
     </w:p>
     <w:p>
       <w:r>
@@ -351,6 +1687,56 @@
     </w:sectPr>
   </w:body>
 </w:document>
+</file>
+
+<file path=word/endnotes.xml><?xml version="1.0" encoding="utf-8"?>
+<w:endnotes xmlns:wpc="http://schemas.microsoft.com/office/word/2010/wordprocessingCanvas" xmlns:cx="http://schemas.microsoft.com/office/drawing/2014/chartex" xmlns:cx1="http://schemas.microsoft.com/office/drawing/2015/9/8/chartex" xmlns:cx2="http://schemas.microsoft.com/office/drawing/2015/10/21/chartex" xmlns:cx3="http://schemas.microsoft.com/office/drawing/2016/5/9/chartex" xmlns:cx4="http://schemas.microsoft.com/office/drawing/2016/5/10/chartex" xmlns:cx5="http://schemas.microsoft.com/office/drawing/2016/5/11/chartex" xmlns:cx6="http://schemas.microsoft.com/office/drawing/2016/5/12/chartex" xmlns:cx7="http://schemas.microsoft.com/office/drawing/2016/5/13/chartex" xmlns:cx8="http://schemas.microsoft.com/office/drawing/2016/5/14/chartex" xmlns:mc="http://schemas.openxmlformats.org/markup-compatibility/2006" xmlns:aink="http://schemas.microsoft.com/office/drawing/2016/ink" xmlns:am3d="http://schemas.microsoft.com/office/drawing/2017/model3d" xmlns:o="urn:schemas-microsoft-com:office:office" xmlns:oel="http://schemas.microsoft.com/office/2019/extlst" xmlns:r="http://schemas.openxmlformats.org/officeDocument/2006/relationships" xmlns:m="http://schemas.openxmlformats.org/officeDocument/2006/math" xmlns:v="urn:schemas-microsoft-com:vml" xmlns:wp14="http://schemas.microsoft.com/office/word/2010/wordprocessingDrawing" xmlns:wp="http://schemas.openxmlformats.org/drawingml/2006/wordprocessingDrawing" xmlns:w10="urn:schemas-microsoft-com:office:word" xmlns:w="http://schemas.openxmlformats.org/wordprocessingml/2006/main" xmlns:w14="http://schemas.microsoft.com/office/word/2010/wordml" xmlns:w15="http://schemas.microsoft.com/office/word/2012/wordml" xmlns:w16cex="http://schemas.microsoft.com/office/word/2018/wordml/cex" xmlns:w16cid="http://schemas.microsoft.com/office/word/2016/wordml/cid" xmlns:w16="http://schemas.microsoft.com/office/word/2018/wordml" xmlns:w16du="http://schemas.microsoft.com/office/word/2023/wordml/word16du" xmlns:w16sdtdh="http://schemas.microsoft.com/office/word/2020/wordml/sdtdatahash" xmlns:w16sdtfl="http://schemas.microsoft.com/office/word/2024/wordml/sdtformatlock" xmlns:w16se="http://schemas.microsoft.com/office/word/2015/wordml/symex" xmlns:wpg="http://schemas.microsoft.com/office/word/2010/wordprocessingGroup" xmlns:wpi="http://schemas.microsoft.com/office/word/2010/wordprocessingInk" xmlns:wne="http://schemas.microsoft.com/office/word/2006/wordml" xmlns:wps="http://schemas.microsoft.com/office/word/2010/wordprocessingShape" mc:Ignorable="w14 w15 w16se w16cid w16 w16cex w16sdtdh w16sdtfl w16du wp14">
+  <w:endnote w:type="separator" w:id="-1">
+    <w:p>
+      <w:pPr>
+        <w:spacing w:after="0" w:line="240" w:lineRule="auto"/>
+      </w:pPr>
+      <w:r>
+        <w:separator/>
+      </w:r>
+    </w:p>
+  </w:endnote>
+  <w:endnote w:type="continuationSeparator" w:id="0">
+    <w:p>
+      <w:pPr>
+        <w:spacing w:after="0" w:line="240" w:lineRule="auto"/>
+      </w:pPr>
+      <w:r>
+        <w:continuationSeparator/>
+      </w:r>
+    </w:p>
+  </w:endnote>
+</w:endnotes>
+</file>
+
+<file path=word/footnotes.xml><?xml version="1.0" encoding="utf-8"?>
+<w:footnotes xmlns:wpc="http://schemas.microsoft.com/office/word/2010/wordprocessingCanvas" xmlns:cx="http://schemas.microsoft.com/office/drawing/2014/chartex" xmlns:cx1="http://schemas.microsoft.com/office/drawing/2015/9/8/chartex" xmlns:cx2="http://schemas.microsoft.com/office/drawing/2015/10/21/chartex" xmlns:cx3="http://schemas.microsoft.com/office/drawing/2016/5/9/chartex" xmlns:cx4="http://schemas.microsoft.com/office/drawing/2016/5/10/chartex" xmlns:cx5="http://schemas.microsoft.com/office/drawing/2016/5/11/chartex" xmlns:cx6="http://schemas.microsoft.com/office/drawing/2016/5/12/chartex" xmlns:cx7="http://schemas.microsoft.com/office/drawing/2016/5/13/chartex" xmlns:cx8="http://schemas.microsoft.com/office/drawing/2016/5/14/chartex" xmlns:mc="http://schemas.openxmlformats.org/markup-compatibility/2006" xmlns:aink="http://schemas.microsoft.com/office/drawing/2016/ink" xmlns:am3d="http://schemas.microsoft.com/office/drawing/2017/model3d" xmlns:o="urn:schemas-microsoft-com:office:office" xmlns:oel="http://schemas.microsoft.com/office/2019/extlst" xmlns:r="http://schemas.openxmlformats.org/officeDocument/2006/relationships" xmlns:m="http://schemas.openxmlformats.org/officeDocument/2006/math" xmlns:v="urn:schemas-microsoft-com:vml" xmlns:wp14="http://schemas.microsoft.com/office/word/2010/wordprocessingDrawing" xmlns:wp="http://schemas.openxmlformats.org/drawingml/2006/wordprocessingDrawing" xmlns:w10="urn:schemas-microsoft-com:office:word" xmlns:w="http://schemas.openxmlformats.org/wordprocessingml/2006/main" xmlns:w14="http://schemas.microsoft.com/office/word/2010/wordml" xmlns:w15="http://schemas.microsoft.com/office/word/2012/wordml" xmlns:w16cex="http://schemas.microsoft.com/office/word/2018/wordml/cex" xmlns:w16cid="http://schemas.microsoft.com/office/word/2016/wordml/cid" xmlns:w16="http://schemas.microsoft.com/office/word/2018/wordml" xmlns:w16du="http://schemas.microsoft.com/office/word/2023/wordml/word16du" xmlns:w16sdtdh="http://schemas.microsoft.com/office/word/2020/wordml/sdtdatahash" xmlns:w16sdtfl="http://schemas.microsoft.com/office/word/2024/wordml/sdtformatlock" xmlns:w16se="http://schemas.microsoft.com/office/word/2015/wordml/symex" xmlns:wpg="http://schemas.microsoft.com/office/word/2010/wordprocessingGroup" xmlns:wpi="http://schemas.microsoft.com/office/word/2010/wordprocessingInk" xmlns:wne="http://schemas.microsoft.com/office/word/2006/wordml" xmlns:wps="http://schemas.microsoft.com/office/word/2010/wordprocessingShape" mc:Ignorable="w14 w15 w16se w16cid w16 w16cex w16sdtdh w16sdtfl w16du wp14">
+  <w:footnote w:type="separator" w:id="-1">
+    <w:p>
+      <w:pPr>
+        <w:spacing w:after="0" w:line="240" w:lineRule="auto"/>
+      </w:pPr>
+      <w:r>
+        <w:separator/>
+      </w:r>
+    </w:p>
+  </w:footnote>
+  <w:footnote w:type="continuationSeparator" w:id="0">
+    <w:p>
+      <w:pPr>
+        <w:spacing w:after="0" w:line="240" w:lineRule="auto"/>
+      </w:pPr>
+      <w:r>
+        <w:continuationSeparator/>
+      </w:r>
+    </w:p>
+  </w:footnote>
+</w:footnotes>
 </file>
 
 <file path=word/numbering.xml><?xml version="1.0" encoding="utf-8"?>
@@ -3087,7 +4473,6 @@
   <w:style w:type="character" w:default="1" w:styleId="DefaultParagraphFont">
     <w:name w:val="Default Paragraph Font"/>
     <w:uiPriority w:val="1"/>
-    <w:semiHidden/>
     <w:unhideWhenUsed/>
   </w:style>
   <w:style w:type="table" w:default="1" w:styleId="TableNormal">
@@ -3397,6 +4782,119 @@
       <w:smallCaps/>
       <w:color w:val="0F4761" w:themeColor="accent1" w:themeShade="BF"/>
       <w:spacing w:val="5"/>
+    </w:rPr>
+  </w:style>
+  <w:style w:type="paragraph" w:styleId="Header">
+    <w:name w:val="header"/>
+    <w:basedOn w:val="Normal"/>
+    <w:link w:val="HeaderChar"/>
+    <w:uiPriority w:val="99"/>
+    <w:unhideWhenUsed/>
+    <w:rsid w:val="00803D93"/>
+    <w:pPr>
+      <w:tabs>
+        <w:tab w:val="center" w:pos="4513"/>
+        <w:tab w:val="right" w:pos="9026"/>
+      </w:tabs>
+      <w:spacing w:after="0" w:line="240" w:lineRule="auto"/>
+    </w:pPr>
+  </w:style>
+  <w:style w:type="character" w:customStyle="1" w:styleId="HeaderChar">
+    <w:name w:val="Header Char"/>
+    <w:basedOn w:val="DefaultParagraphFont"/>
+    <w:link w:val="Header"/>
+    <w:uiPriority w:val="99"/>
+    <w:rsid w:val="00803D93"/>
+  </w:style>
+  <w:style w:type="paragraph" w:styleId="Footer">
+    <w:name w:val="footer"/>
+    <w:basedOn w:val="Normal"/>
+    <w:link w:val="FooterChar"/>
+    <w:uiPriority w:val="99"/>
+    <w:unhideWhenUsed/>
+    <w:rsid w:val="00803D93"/>
+    <w:pPr>
+      <w:tabs>
+        <w:tab w:val="center" w:pos="4513"/>
+        <w:tab w:val="right" w:pos="9026"/>
+      </w:tabs>
+      <w:spacing w:after="0" w:line="240" w:lineRule="auto"/>
+    </w:pPr>
+  </w:style>
+  <w:style w:type="character" w:customStyle="1" w:styleId="FooterChar">
+    <w:name w:val="Footer Char"/>
+    <w:basedOn w:val="DefaultParagraphFont"/>
+    <w:link w:val="Footer"/>
+    <w:uiPriority w:val="99"/>
+    <w:rsid w:val="00803D93"/>
+  </w:style>
+  <w:style w:type="paragraph" w:styleId="TOCHeading">
+    <w:name w:val="TOC Heading"/>
+    <w:basedOn w:val="Heading1"/>
+    <w:next w:val="Normal"/>
+    <w:uiPriority w:val="39"/>
+    <w:unhideWhenUsed/>
+    <w:qFormat/>
+    <w:rsid w:val="00615B96"/>
+    <w:pPr>
+      <w:spacing w:before="240" w:after="0" w:line="259" w:lineRule="auto"/>
+      <w:outlineLvl w:val="9"/>
+    </w:pPr>
+    <w:rPr>
+      <w:kern w:val="0"/>
+      <w:sz w:val="32"/>
+      <w:szCs w:val="32"/>
+      <w:lang w:eastAsia="en-ZA"/>
+      <w14:ligatures w14:val="none"/>
+    </w:rPr>
+  </w:style>
+  <w:style w:type="paragraph" w:styleId="TOC1">
+    <w:name w:val="toc 1"/>
+    <w:basedOn w:val="Normal"/>
+    <w:next w:val="Normal"/>
+    <w:autoRedefine/>
+    <w:uiPriority w:val="39"/>
+    <w:unhideWhenUsed/>
+    <w:rsid w:val="00615B96"/>
+    <w:pPr>
+      <w:spacing w:after="100"/>
+    </w:pPr>
+  </w:style>
+  <w:style w:type="paragraph" w:styleId="TOC2">
+    <w:name w:val="toc 2"/>
+    <w:basedOn w:val="Normal"/>
+    <w:next w:val="Normal"/>
+    <w:autoRedefine/>
+    <w:uiPriority w:val="39"/>
+    <w:unhideWhenUsed/>
+    <w:rsid w:val="00615B96"/>
+    <w:pPr>
+      <w:spacing w:after="100"/>
+      <w:ind w:left="240"/>
+    </w:pPr>
+  </w:style>
+  <w:style w:type="paragraph" w:styleId="TOC3">
+    <w:name w:val="toc 3"/>
+    <w:basedOn w:val="Normal"/>
+    <w:next w:val="Normal"/>
+    <w:autoRedefine/>
+    <w:uiPriority w:val="39"/>
+    <w:unhideWhenUsed/>
+    <w:rsid w:val="00615B96"/>
+    <w:pPr>
+      <w:spacing w:after="100"/>
+      <w:ind w:left="480"/>
+    </w:pPr>
+  </w:style>
+  <w:style w:type="character" w:styleId="Hyperlink">
+    <w:name w:val="Hyperlink"/>
+    <w:basedOn w:val="DefaultParagraphFont"/>
+    <w:uiPriority w:val="99"/>
+    <w:unhideWhenUsed/>
+    <w:rsid w:val="00615B96"/>
+    <w:rPr>
+      <w:color w:val="467886" w:themeColor="hyperlink"/>
+      <w:u w:val="single"/>
     </w:rPr>
   </w:style>
 </w:styles>
@@ -3715,4 +5213,16 @@
     </a:ext>
   </a:extLst>
 </a:theme>
+</file>
+
+<file path=customXml/item1.xml><?xml version="1.0" encoding="utf-8"?>
+<b:Sources xmlns:b="http://schemas.openxmlformats.org/officeDocument/2006/bibliography" xmlns="http://schemas.openxmlformats.org/officeDocument/2006/bibliography" SelectedStyle="\APASixthEditionOfficeOnline.xsl" StyleName="APA" Version="6"/>
+</file>
+
+<file path=customXml/itemProps1.xml><?xml version="1.0" encoding="utf-8"?>
+<ds:datastoreItem xmlns:ds="http://schemas.openxmlformats.org/officeDocument/2006/customXml" ds:itemID="{16B92BC0-1BEB-4434-A4F5-9222B51922A6}">
+  <ds:schemaRefs>
+    <ds:schemaRef ds:uri="http://schemas.openxmlformats.org/officeDocument/2006/bibliography"/>
+  </ds:schemaRefs>
+</ds:datastoreItem>
 </file>
</xml_diff>

<commit_message>
Changes made to project
</commit_message>
<xml_diff>
--- a/Data Analysis Project/project/reports/Report.docx
+++ b/Data Analysis Project/project/reports/Report.docx
@@ -16,7 +16,7 @@
           <w:noProof/>
         </w:rPr>
         <w:drawing>
-          <wp:anchor distT="0" distB="0" distL="114300" distR="114300" simplePos="0" relativeHeight="251659264" behindDoc="1" locked="0" layoutInCell="1" allowOverlap="1" wp14:anchorId="6DAC56A9" wp14:editId="665137E6">
+          <wp:anchor distT="0" distB="0" distL="114300" distR="114300" simplePos="0" relativeHeight="251659264" behindDoc="1" locked="0" layoutInCell="1" allowOverlap="1" wp14:anchorId="6DAC56A9" wp14:editId="312364BB">
             <wp:simplePos x="0" y="0"/>
             <wp:positionH relativeFrom="margin">
               <wp:align>center</wp:align>
@@ -148,7 +148,13 @@
     <w:sdt>
       <w:sdtPr>
         <w:rPr>
-          <w:lang w:val="en-GB"/>
+          <w:rFonts w:asciiTheme="minorHAnsi" w:eastAsiaTheme="minorHAnsi" w:hAnsiTheme="minorHAnsi" w:cstheme="minorBidi"/>
+          <w:color w:val="auto"/>
+          <w:kern w:val="2"/>
+          <w:sz w:val="24"/>
+          <w:szCs w:val="24"/>
+          <w:lang w:val="en-GB" w:eastAsia="en-US"/>
+          <w14:ligatures w14:val="standardContextual"/>
         </w:rPr>
         <w:id w:val="1091892714"/>
         <w:docPartObj>
@@ -158,15 +164,8 @@
       </w:sdtPr>
       <w:sdtEndPr>
         <w:rPr>
-          <w:rFonts w:asciiTheme="minorHAnsi" w:eastAsiaTheme="minorHAnsi" w:hAnsiTheme="minorHAnsi" w:cstheme="minorBidi"/>
           <w:b/>
           <w:bCs/>
-          <w:color w:val="auto"/>
-          <w:kern w:val="2"/>
-          <w:sz w:val="24"/>
-          <w:szCs w:val="24"/>
-          <w:lang w:eastAsia="en-US"/>
-          <w14:ligatures w14:val="standardContextual"/>
         </w:rPr>
       </w:sdtEndPr>
       <w:sdtContent>
@@ -1208,6 +1207,9 @@
     </w:p>
     <w:p>
       <w:r>
+        <w:rPr>
+          <w:noProof/>
+        </w:rPr>
         <w:drawing>
           <wp:anchor distT="0" distB="0" distL="114300" distR="114300" simplePos="0" relativeHeight="251660288" behindDoc="0" locked="0" layoutInCell="1" allowOverlap="1" wp14:anchorId="2033533E" wp14:editId="2731735C">
             <wp:simplePos x="0" y="0"/>
@@ -1315,6 +1317,9 @@
     </w:p>
     <w:p>
       <w:r>
+        <w:rPr>
+          <w:noProof/>
+        </w:rPr>
         <w:drawing>
           <wp:anchor distT="0" distB="0" distL="114300" distR="114300" simplePos="0" relativeHeight="251661312" behindDoc="0" locked="0" layoutInCell="1" allowOverlap="1" wp14:anchorId="6413F03D" wp14:editId="5EC9A54C">
             <wp:simplePos x="0" y="0"/>
@@ -1407,6 +1412,9 @@
         </w:rPr>
       </w:pPr>
       <w:r>
+        <w:rPr>
+          <w:noProof/>
+        </w:rPr>
         <w:drawing>
           <wp:anchor distT="0" distB="0" distL="114300" distR="114300" simplePos="0" relativeHeight="251662336" behindDoc="0" locked="0" layoutInCell="1" allowOverlap="1" wp14:anchorId="77FFE123" wp14:editId="5E95F9B7">
             <wp:simplePos x="0" y="0"/>
@@ -1516,6 +1524,9 @@
     </w:p>
     <w:p>
       <w:r>
+        <w:rPr>
+          <w:noProof/>
+        </w:rPr>
         <w:drawing>
           <wp:anchor distT="0" distB="0" distL="114300" distR="114300" simplePos="0" relativeHeight="251663360" behindDoc="0" locked="0" layoutInCell="1" allowOverlap="1" wp14:anchorId="0027015E" wp14:editId="7E7191CD">
             <wp:simplePos x="0" y="0"/>
@@ -4473,6 +4484,7 @@
   <w:style w:type="character" w:default="1" w:styleId="DefaultParagraphFont">
     <w:name w:val="Default Paragraph Font"/>
     <w:uiPriority w:val="1"/>
+    <w:semiHidden/>
     <w:unhideWhenUsed/>
   </w:style>
   <w:style w:type="table" w:default="1" w:styleId="TableNormal">

</xml_diff>

<commit_message>
Commit Report changes for project
</commit_message>
<xml_diff>
--- a/Data Analysis Project/project/reports/Report.docx
+++ b/Data Analysis Project/project/reports/Report.docx
@@ -7,12 +7,14 @@
         <w:pStyle w:val="Heading1"/>
         <w:jc w:val="center"/>
         <w:rPr>
+          <w:rFonts w:ascii="Calibri" w:hAnsi="Calibri" w:cs="Calibri"/>
           <w:color w:val="auto"/>
         </w:rPr>
       </w:pPr>
       <w:bookmarkStart w:id="0" w:name="_Toc228368032"/>
       <w:r>
         <w:rPr>
+          <w:rFonts w:ascii="Calibri" w:hAnsi="Calibri" w:cs="Calibri"/>
           <w:noProof/>
         </w:rPr>
         <w:drawing>
@@ -103,12 +105,14 @@
         <w:pStyle w:val="Heading1"/>
         <w:jc w:val="center"/>
         <w:rPr>
+          <w:rFonts w:ascii="Calibri" w:hAnsi="Calibri" w:cs="Calibri"/>
           <w:color w:val="auto"/>
         </w:rPr>
       </w:pPr>
       <w:bookmarkStart w:id="1" w:name="_Toc228368033"/>
       <w:r>
         <w:rPr>
+          <w:rFonts w:ascii="Calibri" w:hAnsi="Calibri" w:cs="Calibri"/>
           <w:color w:val="auto"/>
         </w:rPr>
         <w:t>SALES DATA ANALYSIS REPORT</w:t>
@@ -119,28 +123,32 @@
       <w:pPr>
         <w:jc w:val="center"/>
         <w:rPr>
-          <w:sz w:val="36"/>
-          <w:szCs w:val="36"/>
+          <w:rFonts w:ascii="Calibri" w:hAnsi="Calibri" w:cs="Calibri"/>
+          <w:sz w:val="32"/>
+          <w:szCs w:val="32"/>
         </w:rPr>
       </w:pPr>
       <w:r>
         <w:rPr>
-          <w:sz w:val="36"/>
-          <w:szCs w:val="36"/>
+          <w:rFonts w:ascii="Calibri" w:hAnsi="Calibri" w:cs="Calibri"/>
+          <w:sz w:val="32"/>
+          <w:szCs w:val="32"/>
         </w:rPr>
         <w:t>Rushil Jivan</w:t>
       </w:r>
       <w:r>
         <w:rPr>
-          <w:sz w:val="36"/>
-          <w:szCs w:val="36"/>
+          <w:rFonts w:ascii="Calibri" w:hAnsi="Calibri" w:cs="Calibri"/>
+          <w:sz w:val="32"/>
+          <w:szCs w:val="32"/>
         </w:rPr>
         <w:t xml:space="preserve"> - </w:t>
       </w:r>
       <w:r>
         <w:rPr>
-          <w:sz w:val="36"/>
-          <w:szCs w:val="36"/>
+          <w:rFonts w:ascii="Calibri" w:hAnsi="Calibri" w:cs="Calibri"/>
+          <w:sz w:val="32"/>
+          <w:szCs w:val="32"/>
         </w:rPr>
         <w:t>2026</w:t>
       </w:r>
@@ -148,7 +156,7 @@
     <w:sdt>
       <w:sdtPr>
         <w:rPr>
-          <w:rFonts w:asciiTheme="minorHAnsi" w:eastAsiaTheme="minorHAnsi" w:hAnsiTheme="minorHAnsi" w:cstheme="minorBidi"/>
+          <w:rFonts w:ascii="Calibri" w:eastAsiaTheme="minorHAnsi" w:hAnsi="Calibri" w:cs="Calibri"/>
           <w:color w:val="auto"/>
           <w:kern w:val="2"/>
           <w:sz w:val="24"/>
@@ -173,11 +181,13 @@
           <w:pPr>
             <w:pStyle w:val="TOCHeading"/>
             <w:rPr>
+              <w:rFonts w:ascii="Calibri" w:hAnsi="Calibri" w:cs="Calibri"/>
               <w:color w:val="auto"/>
             </w:rPr>
           </w:pPr>
           <w:r>
             <w:rPr>
+              <w:rFonts w:ascii="Calibri" w:hAnsi="Calibri" w:cs="Calibri"/>
               <w:color w:val="auto"/>
               <w:lang w:val="en-GB"/>
             </w:rPr>
@@ -191,23 +201,33 @@
               <w:tab w:val="right" w:leader="dot" w:pos="9016"/>
             </w:tabs>
             <w:rPr>
-              <w:rFonts w:eastAsiaTheme="minorEastAsia"/>
+              <w:rFonts w:ascii="Calibri" w:eastAsiaTheme="minorEastAsia" w:hAnsi="Calibri" w:cs="Calibri"/>
               <w:noProof/>
               <w:lang w:eastAsia="en-ZA"/>
             </w:rPr>
           </w:pPr>
           <w:r>
+            <w:rPr>
+              <w:rFonts w:ascii="Calibri" w:hAnsi="Calibri" w:cs="Calibri"/>
+            </w:rPr>
             <w:fldChar w:fldCharType="begin"/>
           </w:r>
           <w:r>
+            <w:rPr>
+              <w:rFonts w:ascii="Calibri" w:hAnsi="Calibri" w:cs="Calibri"/>
+            </w:rPr>
             <w:instrText xml:space="preserve"> TOC \o "1-3" \h \z \u </w:instrText>
           </w:r>
           <w:r>
+            <w:rPr>
+              <w:rFonts w:ascii="Calibri" w:hAnsi="Calibri" w:cs="Calibri"/>
+            </w:rPr>
             <w:fldChar w:fldCharType="separate"/>
           </w:r>
           <w:hyperlink w:anchor="_Toc228368032" w:history="1">
             <w:r>
               <w:rPr>
+                <w:rFonts w:ascii="Calibri" w:hAnsi="Calibri" w:cs="Calibri"/>
                 <w:noProof/>
                 <w:webHidden/>
               </w:rPr>
@@ -215,6 +235,7 @@
             </w:r>
             <w:r>
               <w:rPr>
+                <w:rFonts w:ascii="Calibri" w:hAnsi="Calibri" w:cs="Calibri"/>
                 <w:noProof/>
                 <w:webHidden/>
               </w:rPr>
@@ -222,6 +243,7 @@
             </w:r>
             <w:r>
               <w:rPr>
+                <w:rFonts w:ascii="Calibri" w:hAnsi="Calibri" w:cs="Calibri"/>
                 <w:noProof/>
                 <w:webHidden/>
               </w:rPr>
@@ -229,12 +251,14 @@
             </w:r>
             <w:r>
               <w:rPr>
-                <w:noProof/>
-                <w:webHidden/>
-              </w:rPr>
-            </w:r>
-            <w:r>
-              <w:rPr>
+                <w:rFonts w:ascii="Calibri" w:hAnsi="Calibri" w:cs="Calibri"/>
+                <w:noProof/>
+                <w:webHidden/>
+              </w:rPr>
+            </w:r>
+            <w:r>
+              <w:rPr>
+                <w:rFonts w:ascii="Calibri" w:hAnsi="Calibri" w:cs="Calibri"/>
                 <w:noProof/>
                 <w:webHidden/>
               </w:rPr>
@@ -242,6 +266,7 @@
             </w:r>
             <w:r>
               <w:rPr>
+                <w:rFonts w:ascii="Calibri" w:hAnsi="Calibri" w:cs="Calibri"/>
                 <w:noProof/>
                 <w:webHidden/>
               </w:rPr>
@@ -249,6 +274,7 @@
             </w:r>
             <w:r>
               <w:rPr>
+                <w:rFonts w:ascii="Calibri" w:hAnsi="Calibri" w:cs="Calibri"/>
                 <w:noProof/>
                 <w:webHidden/>
               </w:rPr>
@@ -263,7 +289,7 @@
               <w:tab w:val="right" w:leader="dot" w:pos="9016"/>
             </w:tabs>
             <w:rPr>
-              <w:rFonts w:eastAsiaTheme="minorEastAsia"/>
+              <w:rFonts w:ascii="Calibri" w:eastAsiaTheme="minorEastAsia" w:hAnsi="Calibri" w:cs="Calibri"/>
               <w:noProof/>
               <w:lang w:eastAsia="en-ZA"/>
             </w:rPr>
@@ -272,12 +298,14 @@
             <w:r>
               <w:rPr>
                 <w:rStyle w:val="Hyperlink"/>
+                <w:rFonts w:ascii="Calibri" w:hAnsi="Calibri" w:cs="Calibri"/>
                 <w:noProof/>
               </w:rPr>
               <w:t>SALES DATA ANALYSIS REPORT</w:t>
             </w:r>
             <w:r>
               <w:rPr>
+                <w:rFonts w:ascii="Calibri" w:hAnsi="Calibri" w:cs="Calibri"/>
                 <w:noProof/>
                 <w:webHidden/>
               </w:rPr>
@@ -285,6 +313,7 @@
             </w:r>
             <w:r>
               <w:rPr>
+                <w:rFonts w:ascii="Calibri" w:hAnsi="Calibri" w:cs="Calibri"/>
                 <w:noProof/>
                 <w:webHidden/>
               </w:rPr>
@@ -292,6 +321,7 @@
             </w:r>
             <w:r>
               <w:rPr>
+                <w:rFonts w:ascii="Calibri" w:hAnsi="Calibri" w:cs="Calibri"/>
                 <w:noProof/>
                 <w:webHidden/>
               </w:rPr>
@@ -299,12 +329,14 @@
             </w:r>
             <w:r>
               <w:rPr>
-                <w:noProof/>
-                <w:webHidden/>
-              </w:rPr>
-            </w:r>
-            <w:r>
-              <w:rPr>
+                <w:rFonts w:ascii="Calibri" w:hAnsi="Calibri" w:cs="Calibri"/>
+                <w:noProof/>
+                <w:webHidden/>
+              </w:rPr>
+            </w:r>
+            <w:r>
+              <w:rPr>
+                <w:rFonts w:ascii="Calibri" w:hAnsi="Calibri" w:cs="Calibri"/>
                 <w:noProof/>
                 <w:webHidden/>
               </w:rPr>
@@ -312,6 +344,7 @@
             </w:r>
             <w:r>
               <w:rPr>
+                <w:rFonts w:ascii="Calibri" w:hAnsi="Calibri" w:cs="Calibri"/>
                 <w:noProof/>
                 <w:webHidden/>
               </w:rPr>
@@ -319,6 +352,7 @@
             </w:r>
             <w:r>
               <w:rPr>
+                <w:rFonts w:ascii="Calibri" w:hAnsi="Calibri" w:cs="Calibri"/>
                 <w:noProof/>
                 <w:webHidden/>
               </w:rPr>
@@ -333,7 +367,7 @@
               <w:tab w:val="right" w:leader="dot" w:pos="9016"/>
             </w:tabs>
             <w:rPr>
-              <w:rFonts w:eastAsiaTheme="minorEastAsia"/>
+              <w:rFonts w:ascii="Calibri" w:eastAsiaTheme="minorEastAsia" w:hAnsi="Calibri" w:cs="Calibri"/>
               <w:noProof/>
               <w:lang w:eastAsia="en-ZA"/>
             </w:rPr>
@@ -342,12 +376,14 @@
             <w:r>
               <w:rPr>
                 <w:rStyle w:val="Hyperlink"/>
+                <w:rFonts w:ascii="Calibri" w:hAnsi="Calibri" w:cs="Calibri"/>
                 <w:noProof/>
               </w:rPr>
               <w:t>1. Introduction</w:t>
             </w:r>
             <w:r>
               <w:rPr>
+                <w:rFonts w:ascii="Calibri" w:hAnsi="Calibri" w:cs="Calibri"/>
                 <w:noProof/>
                 <w:webHidden/>
               </w:rPr>
@@ -355,6 +391,7 @@
             </w:r>
             <w:r>
               <w:rPr>
+                <w:rFonts w:ascii="Calibri" w:hAnsi="Calibri" w:cs="Calibri"/>
                 <w:noProof/>
                 <w:webHidden/>
               </w:rPr>
@@ -362,6 +399,7 @@
             </w:r>
             <w:r>
               <w:rPr>
+                <w:rFonts w:ascii="Calibri" w:hAnsi="Calibri" w:cs="Calibri"/>
                 <w:noProof/>
                 <w:webHidden/>
               </w:rPr>
@@ -369,12 +407,14 @@
             </w:r>
             <w:r>
               <w:rPr>
-                <w:noProof/>
-                <w:webHidden/>
-              </w:rPr>
-            </w:r>
-            <w:r>
-              <w:rPr>
+                <w:rFonts w:ascii="Calibri" w:hAnsi="Calibri" w:cs="Calibri"/>
+                <w:noProof/>
+                <w:webHidden/>
+              </w:rPr>
+            </w:r>
+            <w:r>
+              <w:rPr>
+                <w:rFonts w:ascii="Calibri" w:hAnsi="Calibri" w:cs="Calibri"/>
                 <w:noProof/>
                 <w:webHidden/>
               </w:rPr>
@@ -382,6 +422,7 @@
             </w:r>
             <w:r>
               <w:rPr>
+                <w:rFonts w:ascii="Calibri" w:hAnsi="Calibri" w:cs="Calibri"/>
                 <w:noProof/>
                 <w:webHidden/>
               </w:rPr>
@@ -389,6 +430,7 @@
             </w:r>
             <w:r>
               <w:rPr>
+                <w:rFonts w:ascii="Calibri" w:hAnsi="Calibri" w:cs="Calibri"/>
                 <w:noProof/>
                 <w:webHidden/>
               </w:rPr>
@@ -403,7 +445,7 @@
               <w:tab w:val="right" w:leader="dot" w:pos="9016"/>
             </w:tabs>
             <w:rPr>
-              <w:rFonts w:eastAsiaTheme="minorEastAsia"/>
+              <w:rFonts w:ascii="Calibri" w:eastAsiaTheme="minorEastAsia" w:hAnsi="Calibri" w:cs="Calibri"/>
               <w:noProof/>
               <w:lang w:eastAsia="en-ZA"/>
             </w:rPr>
@@ -412,12 +454,14 @@
             <w:r>
               <w:rPr>
                 <w:rStyle w:val="Hyperlink"/>
+                <w:rFonts w:ascii="Calibri" w:hAnsi="Calibri" w:cs="Calibri"/>
                 <w:noProof/>
               </w:rPr>
               <w:t>2. Data Overview</w:t>
             </w:r>
             <w:r>
               <w:rPr>
+                <w:rFonts w:ascii="Calibri" w:hAnsi="Calibri" w:cs="Calibri"/>
                 <w:noProof/>
                 <w:webHidden/>
               </w:rPr>
@@ -425,6 +469,7 @@
             </w:r>
             <w:r>
               <w:rPr>
+                <w:rFonts w:ascii="Calibri" w:hAnsi="Calibri" w:cs="Calibri"/>
                 <w:noProof/>
                 <w:webHidden/>
               </w:rPr>
@@ -432,6 +477,7 @@
             </w:r>
             <w:r>
               <w:rPr>
+                <w:rFonts w:ascii="Calibri" w:hAnsi="Calibri" w:cs="Calibri"/>
                 <w:noProof/>
                 <w:webHidden/>
               </w:rPr>
@@ -439,12 +485,14 @@
             </w:r>
             <w:r>
               <w:rPr>
-                <w:noProof/>
-                <w:webHidden/>
-              </w:rPr>
-            </w:r>
-            <w:r>
-              <w:rPr>
+                <w:rFonts w:ascii="Calibri" w:hAnsi="Calibri" w:cs="Calibri"/>
+                <w:noProof/>
+                <w:webHidden/>
+              </w:rPr>
+            </w:r>
+            <w:r>
+              <w:rPr>
+                <w:rFonts w:ascii="Calibri" w:hAnsi="Calibri" w:cs="Calibri"/>
                 <w:noProof/>
                 <w:webHidden/>
               </w:rPr>
@@ -452,6 +500,7 @@
             </w:r>
             <w:r>
               <w:rPr>
+                <w:rFonts w:ascii="Calibri" w:hAnsi="Calibri" w:cs="Calibri"/>
                 <w:noProof/>
                 <w:webHidden/>
               </w:rPr>
@@ -459,6 +508,7 @@
             </w:r>
             <w:r>
               <w:rPr>
+                <w:rFonts w:ascii="Calibri" w:hAnsi="Calibri" w:cs="Calibri"/>
                 <w:noProof/>
                 <w:webHidden/>
               </w:rPr>
@@ -473,7 +523,7 @@
               <w:tab w:val="right" w:leader="dot" w:pos="9016"/>
             </w:tabs>
             <w:rPr>
-              <w:rFonts w:eastAsiaTheme="minorEastAsia"/>
+              <w:rFonts w:ascii="Calibri" w:eastAsiaTheme="minorEastAsia" w:hAnsi="Calibri" w:cs="Calibri"/>
               <w:noProof/>
               <w:lang w:eastAsia="en-ZA"/>
             </w:rPr>
@@ -482,12 +532,14 @@
             <w:r>
               <w:rPr>
                 <w:rStyle w:val="Hyperlink"/>
+                <w:rFonts w:ascii="Calibri" w:hAnsi="Calibri" w:cs="Calibri"/>
                 <w:noProof/>
               </w:rPr>
               <w:t>3. Business Analysis</w:t>
             </w:r>
             <w:r>
               <w:rPr>
+                <w:rFonts w:ascii="Calibri" w:hAnsi="Calibri" w:cs="Calibri"/>
                 <w:noProof/>
                 <w:webHidden/>
               </w:rPr>
@@ -495,6 +547,7 @@
             </w:r>
             <w:r>
               <w:rPr>
+                <w:rFonts w:ascii="Calibri" w:hAnsi="Calibri" w:cs="Calibri"/>
                 <w:noProof/>
                 <w:webHidden/>
               </w:rPr>
@@ -502,6 +555,7 @@
             </w:r>
             <w:r>
               <w:rPr>
+                <w:rFonts w:ascii="Calibri" w:hAnsi="Calibri" w:cs="Calibri"/>
                 <w:noProof/>
                 <w:webHidden/>
               </w:rPr>
@@ -509,12 +563,14 @@
             </w:r>
             <w:r>
               <w:rPr>
-                <w:noProof/>
-                <w:webHidden/>
-              </w:rPr>
-            </w:r>
-            <w:r>
-              <w:rPr>
+                <w:rFonts w:ascii="Calibri" w:hAnsi="Calibri" w:cs="Calibri"/>
+                <w:noProof/>
+                <w:webHidden/>
+              </w:rPr>
+            </w:r>
+            <w:r>
+              <w:rPr>
+                <w:rFonts w:ascii="Calibri" w:hAnsi="Calibri" w:cs="Calibri"/>
                 <w:noProof/>
                 <w:webHidden/>
               </w:rPr>
@@ -522,6 +578,7 @@
             </w:r>
             <w:r>
               <w:rPr>
+                <w:rFonts w:ascii="Calibri" w:hAnsi="Calibri" w:cs="Calibri"/>
                 <w:noProof/>
                 <w:webHidden/>
               </w:rPr>
@@ -529,6 +586,7 @@
             </w:r>
             <w:r>
               <w:rPr>
+                <w:rFonts w:ascii="Calibri" w:hAnsi="Calibri" w:cs="Calibri"/>
                 <w:noProof/>
                 <w:webHidden/>
               </w:rPr>
@@ -543,7 +601,7 @@
               <w:tab w:val="right" w:leader="dot" w:pos="9016"/>
             </w:tabs>
             <w:rPr>
-              <w:rFonts w:eastAsiaTheme="minorEastAsia"/>
+              <w:rFonts w:ascii="Calibri" w:eastAsiaTheme="minorEastAsia" w:hAnsi="Calibri" w:cs="Calibri"/>
               <w:noProof/>
               <w:lang w:eastAsia="en-ZA"/>
             </w:rPr>
@@ -552,12 +610,14 @@
             <w:r>
               <w:rPr>
                 <w:rStyle w:val="Hyperlink"/>
+                <w:rFonts w:ascii="Calibri" w:hAnsi="Calibri" w:cs="Calibri"/>
                 <w:noProof/>
               </w:rPr>
               <w:t>Top Performing Region</w:t>
             </w:r>
             <w:r>
               <w:rPr>
+                <w:rFonts w:ascii="Calibri" w:hAnsi="Calibri" w:cs="Calibri"/>
                 <w:noProof/>
                 <w:webHidden/>
               </w:rPr>
@@ -565,6 +625,7 @@
             </w:r>
             <w:r>
               <w:rPr>
+                <w:rFonts w:ascii="Calibri" w:hAnsi="Calibri" w:cs="Calibri"/>
                 <w:noProof/>
                 <w:webHidden/>
               </w:rPr>
@@ -572,6 +633,7 @@
             </w:r>
             <w:r>
               <w:rPr>
+                <w:rFonts w:ascii="Calibri" w:hAnsi="Calibri" w:cs="Calibri"/>
                 <w:noProof/>
                 <w:webHidden/>
               </w:rPr>
@@ -579,12 +641,14 @@
             </w:r>
             <w:r>
               <w:rPr>
-                <w:noProof/>
-                <w:webHidden/>
-              </w:rPr>
-            </w:r>
-            <w:r>
-              <w:rPr>
+                <w:rFonts w:ascii="Calibri" w:hAnsi="Calibri" w:cs="Calibri"/>
+                <w:noProof/>
+                <w:webHidden/>
+              </w:rPr>
+            </w:r>
+            <w:r>
+              <w:rPr>
+                <w:rFonts w:ascii="Calibri" w:hAnsi="Calibri" w:cs="Calibri"/>
                 <w:noProof/>
                 <w:webHidden/>
               </w:rPr>
@@ -592,6 +656,7 @@
             </w:r>
             <w:r>
               <w:rPr>
+                <w:rFonts w:ascii="Calibri" w:hAnsi="Calibri" w:cs="Calibri"/>
                 <w:noProof/>
                 <w:webHidden/>
               </w:rPr>
@@ -599,6 +664,7 @@
             </w:r>
             <w:r>
               <w:rPr>
+                <w:rFonts w:ascii="Calibri" w:hAnsi="Calibri" w:cs="Calibri"/>
                 <w:noProof/>
                 <w:webHidden/>
               </w:rPr>
@@ -613,7 +679,7 @@
               <w:tab w:val="right" w:leader="dot" w:pos="9016"/>
             </w:tabs>
             <w:rPr>
-              <w:rFonts w:eastAsiaTheme="minorEastAsia"/>
+              <w:rFonts w:ascii="Calibri" w:eastAsiaTheme="minorEastAsia" w:hAnsi="Calibri" w:cs="Calibri"/>
               <w:noProof/>
               <w:lang w:eastAsia="en-ZA"/>
             </w:rPr>
@@ -622,12 +688,14 @@
             <w:r>
               <w:rPr>
                 <w:rStyle w:val="Hyperlink"/>
+                <w:rFonts w:ascii="Calibri" w:hAnsi="Calibri" w:cs="Calibri"/>
                 <w:noProof/>
               </w:rPr>
               <w:t>Highest revenue-generating products</w:t>
             </w:r>
             <w:r>
               <w:rPr>
+                <w:rFonts w:ascii="Calibri" w:hAnsi="Calibri" w:cs="Calibri"/>
                 <w:noProof/>
                 <w:webHidden/>
               </w:rPr>
@@ -635,6 +703,7 @@
             </w:r>
             <w:r>
               <w:rPr>
+                <w:rFonts w:ascii="Calibri" w:hAnsi="Calibri" w:cs="Calibri"/>
                 <w:noProof/>
                 <w:webHidden/>
               </w:rPr>
@@ -642,6 +711,7 @@
             </w:r>
             <w:r>
               <w:rPr>
+                <w:rFonts w:ascii="Calibri" w:hAnsi="Calibri" w:cs="Calibri"/>
                 <w:noProof/>
                 <w:webHidden/>
               </w:rPr>
@@ -649,12 +719,14 @@
             </w:r>
             <w:r>
               <w:rPr>
-                <w:noProof/>
-                <w:webHidden/>
-              </w:rPr>
-            </w:r>
-            <w:r>
-              <w:rPr>
+                <w:rFonts w:ascii="Calibri" w:hAnsi="Calibri" w:cs="Calibri"/>
+                <w:noProof/>
+                <w:webHidden/>
+              </w:rPr>
+            </w:r>
+            <w:r>
+              <w:rPr>
+                <w:rFonts w:ascii="Calibri" w:hAnsi="Calibri" w:cs="Calibri"/>
                 <w:noProof/>
                 <w:webHidden/>
               </w:rPr>
@@ -662,6 +734,7 @@
             </w:r>
             <w:r>
               <w:rPr>
+                <w:rFonts w:ascii="Calibri" w:hAnsi="Calibri" w:cs="Calibri"/>
                 <w:noProof/>
                 <w:webHidden/>
               </w:rPr>
@@ -669,6 +742,7 @@
             </w:r>
             <w:r>
               <w:rPr>
+                <w:rFonts w:ascii="Calibri" w:hAnsi="Calibri" w:cs="Calibri"/>
                 <w:noProof/>
                 <w:webHidden/>
               </w:rPr>
@@ -683,7 +757,7 @@
               <w:tab w:val="right" w:leader="dot" w:pos="9016"/>
             </w:tabs>
             <w:rPr>
-              <w:rFonts w:eastAsiaTheme="minorEastAsia"/>
+              <w:rFonts w:ascii="Calibri" w:eastAsiaTheme="minorEastAsia" w:hAnsi="Calibri" w:cs="Calibri"/>
               <w:noProof/>
               <w:lang w:eastAsia="en-ZA"/>
             </w:rPr>
@@ -692,12 +766,14 @@
             <w:r>
               <w:rPr>
                 <w:rStyle w:val="Hyperlink"/>
+                <w:rFonts w:ascii="Calibri" w:hAnsi="Calibri" w:cs="Calibri"/>
                 <w:noProof/>
               </w:rPr>
               <w:t>Sales Trends Over Time</w:t>
             </w:r>
             <w:r>
               <w:rPr>
+                <w:rFonts w:ascii="Calibri" w:hAnsi="Calibri" w:cs="Calibri"/>
                 <w:noProof/>
                 <w:webHidden/>
               </w:rPr>
@@ -705,6 +781,7 @@
             </w:r>
             <w:r>
               <w:rPr>
+                <w:rFonts w:ascii="Calibri" w:hAnsi="Calibri" w:cs="Calibri"/>
                 <w:noProof/>
                 <w:webHidden/>
               </w:rPr>
@@ -712,6 +789,7 @@
             </w:r>
             <w:r>
               <w:rPr>
+                <w:rFonts w:ascii="Calibri" w:hAnsi="Calibri" w:cs="Calibri"/>
                 <w:noProof/>
                 <w:webHidden/>
               </w:rPr>
@@ -719,12 +797,14 @@
             </w:r>
             <w:r>
               <w:rPr>
-                <w:noProof/>
-                <w:webHidden/>
-              </w:rPr>
-            </w:r>
-            <w:r>
-              <w:rPr>
+                <w:rFonts w:ascii="Calibri" w:hAnsi="Calibri" w:cs="Calibri"/>
+                <w:noProof/>
+                <w:webHidden/>
+              </w:rPr>
+            </w:r>
+            <w:r>
+              <w:rPr>
+                <w:rFonts w:ascii="Calibri" w:hAnsi="Calibri" w:cs="Calibri"/>
                 <w:noProof/>
                 <w:webHidden/>
               </w:rPr>
@@ -732,6 +812,7 @@
             </w:r>
             <w:r>
               <w:rPr>
+                <w:rFonts w:ascii="Calibri" w:hAnsi="Calibri" w:cs="Calibri"/>
                 <w:noProof/>
                 <w:webHidden/>
               </w:rPr>
@@ -739,6 +820,7 @@
             </w:r>
             <w:r>
               <w:rPr>
+                <w:rFonts w:ascii="Calibri" w:hAnsi="Calibri" w:cs="Calibri"/>
                 <w:noProof/>
                 <w:webHidden/>
               </w:rPr>
@@ -753,7 +835,7 @@
               <w:tab w:val="right" w:leader="dot" w:pos="9016"/>
             </w:tabs>
             <w:rPr>
-              <w:rFonts w:eastAsiaTheme="minorEastAsia"/>
+              <w:rFonts w:ascii="Calibri" w:eastAsiaTheme="minorEastAsia" w:hAnsi="Calibri" w:cs="Calibri"/>
               <w:noProof/>
               <w:lang w:eastAsia="en-ZA"/>
             </w:rPr>
@@ -762,12 +844,14 @@
             <w:r>
               <w:rPr>
                 <w:rStyle w:val="Hyperlink"/>
+                <w:rFonts w:ascii="Calibri" w:hAnsi="Calibri" w:cs="Calibri"/>
                 <w:noProof/>
               </w:rPr>
               <w:t>Top-performing Salespeople</w:t>
             </w:r>
             <w:r>
               <w:rPr>
+                <w:rFonts w:ascii="Calibri" w:hAnsi="Calibri" w:cs="Calibri"/>
                 <w:noProof/>
                 <w:webHidden/>
               </w:rPr>
@@ -775,6 +859,7 @@
             </w:r>
             <w:r>
               <w:rPr>
+                <w:rFonts w:ascii="Calibri" w:hAnsi="Calibri" w:cs="Calibri"/>
                 <w:noProof/>
                 <w:webHidden/>
               </w:rPr>
@@ -782,6 +867,7 @@
             </w:r>
             <w:r>
               <w:rPr>
+                <w:rFonts w:ascii="Calibri" w:hAnsi="Calibri" w:cs="Calibri"/>
                 <w:noProof/>
                 <w:webHidden/>
               </w:rPr>
@@ -789,12 +875,14 @@
             </w:r>
             <w:r>
               <w:rPr>
-                <w:noProof/>
-                <w:webHidden/>
-              </w:rPr>
-            </w:r>
-            <w:r>
-              <w:rPr>
+                <w:rFonts w:ascii="Calibri" w:hAnsi="Calibri" w:cs="Calibri"/>
+                <w:noProof/>
+                <w:webHidden/>
+              </w:rPr>
+            </w:r>
+            <w:r>
+              <w:rPr>
+                <w:rFonts w:ascii="Calibri" w:hAnsi="Calibri" w:cs="Calibri"/>
                 <w:noProof/>
                 <w:webHidden/>
               </w:rPr>
@@ -802,6 +890,7 @@
             </w:r>
             <w:r>
               <w:rPr>
+                <w:rFonts w:ascii="Calibri" w:hAnsi="Calibri" w:cs="Calibri"/>
                 <w:noProof/>
                 <w:webHidden/>
               </w:rPr>
@@ -809,6 +898,7 @@
             </w:r>
             <w:r>
               <w:rPr>
+                <w:rFonts w:ascii="Calibri" w:hAnsi="Calibri" w:cs="Calibri"/>
                 <w:noProof/>
                 <w:webHidden/>
               </w:rPr>
@@ -823,7 +913,7 @@
               <w:tab w:val="right" w:leader="dot" w:pos="9016"/>
             </w:tabs>
             <w:rPr>
-              <w:rFonts w:eastAsiaTheme="minorEastAsia"/>
+              <w:rFonts w:ascii="Calibri" w:eastAsiaTheme="minorEastAsia" w:hAnsi="Calibri" w:cs="Calibri"/>
               <w:noProof/>
               <w:lang w:eastAsia="en-ZA"/>
             </w:rPr>
@@ -832,12 +922,14 @@
             <w:r>
               <w:rPr>
                 <w:rStyle w:val="Hyperlink"/>
+                <w:rFonts w:ascii="Calibri" w:hAnsi="Calibri" w:cs="Calibri"/>
                 <w:noProof/>
               </w:rPr>
               <w:t>4. Recommendations</w:t>
             </w:r>
             <w:r>
               <w:rPr>
+                <w:rFonts w:ascii="Calibri" w:hAnsi="Calibri" w:cs="Calibri"/>
                 <w:noProof/>
                 <w:webHidden/>
               </w:rPr>
@@ -845,6 +937,7 @@
             </w:r>
             <w:r>
               <w:rPr>
+                <w:rFonts w:ascii="Calibri" w:hAnsi="Calibri" w:cs="Calibri"/>
                 <w:noProof/>
                 <w:webHidden/>
               </w:rPr>
@@ -852,6 +945,7 @@
             </w:r>
             <w:r>
               <w:rPr>
+                <w:rFonts w:ascii="Calibri" w:hAnsi="Calibri" w:cs="Calibri"/>
                 <w:noProof/>
                 <w:webHidden/>
               </w:rPr>
@@ -859,12 +953,14 @@
             </w:r>
             <w:r>
               <w:rPr>
-                <w:noProof/>
-                <w:webHidden/>
-              </w:rPr>
-            </w:r>
-            <w:r>
-              <w:rPr>
+                <w:rFonts w:ascii="Calibri" w:hAnsi="Calibri" w:cs="Calibri"/>
+                <w:noProof/>
+                <w:webHidden/>
+              </w:rPr>
+            </w:r>
+            <w:r>
+              <w:rPr>
+                <w:rFonts w:ascii="Calibri" w:hAnsi="Calibri" w:cs="Calibri"/>
                 <w:noProof/>
                 <w:webHidden/>
               </w:rPr>
@@ -872,6 +968,7 @@
             </w:r>
             <w:r>
               <w:rPr>
+                <w:rFonts w:ascii="Calibri" w:hAnsi="Calibri" w:cs="Calibri"/>
                 <w:noProof/>
                 <w:webHidden/>
               </w:rPr>
@@ -879,6 +976,7 @@
             </w:r>
             <w:r>
               <w:rPr>
+                <w:rFonts w:ascii="Calibri" w:hAnsi="Calibri" w:cs="Calibri"/>
                 <w:noProof/>
                 <w:webHidden/>
               </w:rPr>
@@ -893,7 +991,7 @@
               <w:tab w:val="right" w:leader="dot" w:pos="9016"/>
             </w:tabs>
             <w:rPr>
-              <w:rFonts w:eastAsiaTheme="minorEastAsia"/>
+              <w:rFonts w:ascii="Calibri" w:eastAsiaTheme="minorEastAsia" w:hAnsi="Calibri" w:cs="Calibri"/>
               <w:noProof/>
               <w:lang w:eastAsia="en-ZA"/>
             </w:rPr>
@@ -902,12 +1000,14 @@
             <w:r>
               <w:rPr>
                 <w:rStyle w:val="Hyperlink"/>
+                <w:rFonts w:ascii="Calibri" w:hAnsi="Calibri" w:cs="Calibri"/>
                 <w:noProof/>
               </w:rPr>
               <w:t>1. Focus on High-Performing Products</w:t>
             </w:r>
             <w:r>
               <w:rPr>
+                <w:rFonts w:ascii="Calibri" w:hAnsi="Calibri" w:cs="Calibri"/>
                 <w:noProof/>
                 <w:webHidden/>
               </w:rPr>
@@ -915,6 +1015,7 @@
             </w:r>
             <w:r>
               <w:rPr>
+                <w:rFonts w:ascii="Calibri" w:hAnsi="Calibri" w:cs="Calibri"/>
                 <w:noProof/>
                 <w:webHidden/>
               </w:rPr>
@@ -922,6 +1023,7 @@
             </w:r>
             <w:r>
               <w:rPr>
+                <w:rFonts w:ascii="Calibri" w:hAnsi="Calibri" w:cs="Calibri"/>
                 <w:noProof/>
                 <w:webHidden/>
               </w:rPr>
@@ -929,12 +1031,14 @@
             </w:r>
             <w:r>
               <w:rPr>
-                <w:noProof/>
-                <w:webHidden/>
-              </w:rPr>
-            </w:r>
-            <w:r>
-              <w:rPr>
+                <w:rFonts w:ascii="Calibri" w:hAnsi="Calibri" w:cs="Calibri"/>
+                <w:noProof/>
+                <w:webHidden/>
+              </w:rPr>
+            </w:r>
+            <w:r>
+              <w:rPr>
+                <w:rFonts w:ascii="Calibri" w:hAnsi="Calibri" w:cs="Calibri"/>
                 <w:noProof/>
                 <w:webHidden/>
               </w:rPr>
@@ -942,6 +1046,7 @@
             </w:r>
             <w:r>
               <w:rPr>
+                <w:rFonts w:ascii="Calibri" w:hAnsi="Calibri" w:cs="Calibri"/>
                 <w:noProof/>
                 <w:webHidden/>
               </w:rPr>
@@ -949,6 +1054,7 @@
             </w:r>
             <w:r>
               <w:rPr>
+                <w:rFonts w:ascii="Calibri" w:hAnsi="Calibri" w:cs="Calibri"/>
                 <w:noProof/>
                 <w:webHidden/>
               </w:rPr>
@@ -963,7 +1069,7 @@
               <w:tab w:val="right" w:leader="dot" w:pos="9016"/>
             </w:tabs>
             <w:rPr>
-              <w:rFonts w:eastAsiaTheme="minorEastAsia"/>
+              <w:rFonts w:ascii="Calibri" w:eastAsiaTheme="minorEastAsia" w:hAnsi="Calibri" w:cs="Calibri"/>
               <w:noProof/>
               <w:lang w:eastAsia="en-ZA"/>
             </w:rPr>
@@ -972,12 +1078,14 @@
             <w:r>
               <w:rPr>
                 <w:rStyle w:val="Hyperlink"/>
+                <w:rFonts w:ascii="Calibri" w:hAnsi="Calibri" w:cs="Calibri"/>
                 <w:noProof/>
               </w:rPr>
               <w:t>2. Improve Performance of Lower-Selling Products</w:t>
             </w:r>
             <w:r>
               <w:rPr>
+                <w:rFonts w:ascii="Calibri" w:hAnsi="Calibri" w:cs="Calibri"/>
                 <w:noProof/>
                 <w:webHidden/>
               </w:rPr>
@@ -985,6 +1093,7 @@
             </w:r>
             <w:r>
               <w:rPr>
+                <w:rFonts w:ascii="Calibri" w:hAnsi="Calibri" w:cs="Calibri"/>
                 <w:noProof/>
                 <w:webHidden/>
               </w:rPr>
@@ -992,6 +1101,7 @@
             </w:r>
             <w:r>
               <w:rPr>
+                <w:rFonts w:ascii="Calibri" w:hAnsi="Calibri" w:cs="Calibri"/>
                 <w:noProof/>
                 <w:webHidden/>
               </w:rPr>
@@ -999,12 +1109,14 @@
             </w:r>
             <w:r>
               <w:rPr>
-                <w:noProof/>
-                <w:webHidden/>
-              </w:rPr>
-            </w:r>
-            <w:r>
-              <w:rPr>
+                <w:rFonts w:ascii="Calibri" w:hAnsi="Calibri" w:cs="Calibri"/>
+                <w:noProof/>
+                <w:webHidden/>
+              </w:rPr>
+            </w:r>
+            <w:r>
+              <w:rPr>
+                <w:rFonts w:ascii="Calibri" w:hAnsi="Calibri" w:cs="Calibri"/>
                 <w:noProof/>
                 <w:webHidden/>
               </w:rPr>
@@ -1012,6 +1124,7 @@
             </w:r>
             <w:r>
               <w:rPr>
+                <w:rFonts w:ascii="Calibri" w:hAnsi="Calibri" w:cs="Calibri"/>
                 <w:noProof/>
                 <w:webHidden/>
               </w:rPr>
@@ -1019,6 +1132,7 @@
             </w:r>
             <w:r>
               <w:rPr>
+                <w:rFonts w:ascii="Calibri" w:hAnsi="Calibri" w:cs="Calibri"/>
                 <w:noProof/>
                 <w:webHidden/>
               </w:rPr>
@@ -1033,7 +1147,7 @@
               <w:tab w:val="right" w:leader="dot" w:pos="9016"/>
             </w:tabs>
             <w:rPr>
-              <w:rFonts w:eastAsiaTheme="minorEastAsia"/>
+              <w:rFonts w:ascii="Calibri" w:eastAsiaTheme="minorEastAsia" w:hAnsi="Calibri" w:cs="Calibri"/>
               <w:noProof/>
               <w:lang w:eastAsia="en-ZA"/>
             </w:rPr>
@@ -1042,12 +1156,14 @@
             <w:r>
               <w:rPr>
                 <w:rStyle w:val="Hyperlink"/>
+                <w:rFonts w:ascii="Calibri" w:hAnsi="Calibri" w:cs="Calibri"/>
                 <w:noProof/>
               </w:rPr>
               <w:t>3. Improve Data Quality Controls</w:t>
             </w:r>
             <w:r>
               <w:rPr>
+                <w:rFonts w:ascii="Calibri" w:hAnsi="Calibri" w:cs="Calibri"/>
                 <w:noProof/>
                 <w:webHidden/>
               </w:rPr>
@@ -1055,6 +1171,7 @@
             </w:r>
             <w:r>
               <w:rPr>
+                <w:rFonts w:ascii="Calibri" w:hAnsi="Calibri" w:cs="Calibri"/>
                 <w:noProof/>
                 <w:webHidden/>
               </w:rPr>
@@ -1062,6 +1179,7 @@
             </w:r>
             <w:r>
               <w:rPr>
+                <w:rFonts w:ascii="Calibri" w:hAnsi="Calibri" w:cs="Calibri"/>
                 <w:noProof/>
                 <w:webHidden/>
               </w:rPr>
@@ -1069,12 +1187,14 @@
             </w:r>
             <w:r>
               <w:rPr>
-                <w:noProof/>
-                <w:webHidden/>
-              </w:rPr>
-            </w:r>
-            <w:r>
-              <w:rPr>
+                <w:rFonts w:ascii="Calibri" w:hAnsi="Calibri" w:cs="Calibri"/>
+                <w:noProof/>
+                <w:webHidden/>
+              </w:rPr>
+            </w:r>
+            <w:r>
+              <w:rPr>
+                <w:rFonts w:ascii="Calibri" w:hAnsi="Calibri" w:cs="Calibri"/>
                 <w:noProof/>
                 <w:webHidden/>
               </w:rPr>
@@ -1082,6 +1202,7 @@
             </w:r>
             <w:r>
               <w:rPr>
+                <w:rFonts w:ascii="Calibri" w:hAnsi="Calibri" w:cs="Calibri"/>
                 <w:noProof/>
                 <w:webHidden/>
               </w:rPr>
@@ -1089,6 +1210,7 @@
             </w:r>
             <w:r>
               <w:rPr>
+                <w:rFonts w:ascii="Calibri" w:hAnsi="Calibri" w:cs="Calibri"/>
                 <w:noProof/>
                 <w:webHidden/>
               </w:rPr>
@@ -1097,8 +1219,14 @@
           </w:hyperlink>
         </w:p>
         <w:p>
+          <w:pPr>
+            <w:rPr>
+              <w:rFonts w:ascii="Calibri" w:hAnsi="Calibri" w:cs="Calibri"/>
+            </w:rPr>
+          </w:pPr>
           <w:r>
             <w:rPr>
+              <w:rFonts w:ascii="Calibri" w:hAnsi="Calibri" w:cs="Calibri"/>
               <w:b/>
               <w:bCs/>
               <w:lang w:val="en-GB"/>
@@ -1112,12 +1240,14 @@
       <w:pPr>
         <w:pStyle w:val="Heading2"/>
         <w:rPr>
+          <w:rFonts w:ascii="Calibri" w:hAnsi="Calibri" w:cs="Calibri"/>
           <w:color w:val="auto"/>
         </w:rPr>
       </w:pPr>
       <w:bookmarkStart w:id="2" w:name="_Toc228368034"/>
       <w:r>
         <w:rPr>
+          <w:rFonts w:ascii="Calibri" w:hAnsi="Calibri" w:cs="Calibri"/>
           <w:color w:val="auto"/>
         </w:rPr>
         <w:t>1. Introduction</w:t>
@@ -1125,39 +1255,73 @@
       <w:bookmarkEnd w:id="2"/>
     </w:p>
     <w:p>
+      <w:pPr>
+        <w:rPr>
+          <w:rFonts w:ascii="Calibri" w:hAnsi="Calibri" w:cs="Calibri"/>
+        </w:rPr>
+      </w:pPr>
       <w:r>
+        <w:rPr>
+          <w:rFonts w:ascii="Calibri" w:hAnsi="Calibri" w:cs="Calibri"/>
+        </w:rPr>
         <w:t>This report analyses sales data to understand performance across regions, products, time periods, and salespeople. The data was cleaned using Python</w:t>
       </w:r>
       <w:r>
+        <w:rPr>
+          <w:rFonts w:ascii="Calibri" w:hAnsi="Calibri" w:cs="Calibri"/>
+        </w:rPr>
         <w:t xml:space="preserve"> and </w:t>
       </w:r>
       <w:r>
+        <w:rPr>
+          <w:rFonts w:ascii="Calibri" w:hAnsi="Calibri" w:cs="Calibri"/>
+        </w:rPr>
         <w:t>analysed in Excel using pivot tables and visualisations to identify business trends. The main goal is to highlight what driv</w:t>
       </w:r>
       <w:r>
+        <w:rPr>
+          <w:rFonts w:ascii="Calibri" w:hAnsi="Calibri" w:cs="Calibri"/>
+        </w:rPr>
         <w:t>es</w:t>
       </w:r>
       <w:r>
+        <w:rPr>
+          <w:rFonts w:ascii="Calibri" w:hAnsi="Calibri" w:cs="Calibri"/>
+        </w:rPr>
         <w:t xml:space="preserve"> revenue and </w:t>
       </w:r>
       <w:r>
+        <w:rPr>
+          <w:rFonts w:ascii="Calibri" w:hAnsi="Calibri" w:cs="Calibri"/>
+        </w:rPr>
         <w:t>give</w:t>
       </w:r>
       <w:r>
+        <w:rPr>
+          <w:rFonts w:ascii="Calibri" w:hAnsi="Calibri" w:cs="Calibri"/>
+        </w:rPr>
         <w:t xml:space="preserve"> insights that can support business decisions.</w:t>
       </w:r>
     </w:p>
-    <w:p/>
     <w:p>
       <w:pPr>
+        <w:rPr>
+          <w:rFonts w:ascii="Calibri" w:hAnsi="Calibri" w:cs="Calibri"/>
+        </w:rPr>
+      </w:pPr>
+    </w:p>
+    <w:p>
+      <w:pPr>
         <w:pStyle w:val="Heading2"/>
         <w:rPr>
+          <w:rFonts w:ascii="Calibri" w:hAnsi="Calibri" w:cs="Calibri"/>
           <w:color w:val="auto"/>
         </w:rPr>
       </w:pPr>
       <w:bookmarkStart w:id="3" w:name="_Toc228368035"/>
       <w:r>
         <w:rPr>
+          <w:rFonts w:ascii="Calibri" w:hAnsi="Calibri" w:cs="Calibri"/>
           <w:color w:val="auto"/>
         </w:rPr>
         <w:t>2. Data Overview</w:t>
@@ -1165,26 +1329,103 @@
       <w:bookmarkEnd w:id="3"/>
     </w:p>
     <w:p>
+      <w:pPr>
+        <w:spacing w:line="240" w:lineRule="auto"/>
+        <w:rPr>
+          <w:rFonts w:ascii="Calibri" w:hAnsi="Calibri" w:cs="Calibri"/>
+        </w:rPr>
+      </w:pPr>
       <w:r>
-        <w:t>The dataset contains sales records including product details, quantities, prices, regions, and salesperson information. During the cleaning process, missing values and</w:t>
+        <w:rPr>
+          <w:rFonts w:ascii="Calibri" w:hAnsi="Calibri" w:cs="Calibri"/>
+        </w:rPr>
+        <w:t>The data</w:t>
       </w:r>
       <w:r>
+        <w:rPr>
+          <w:rFonts w:ascii="Calibri" w:hAnsi="Calibri" w:cs="Calibri"/>
+        </w:rPr>
         <w:t xml:space="preserve"> </w:t>
       </w:r>
       <w:r>
-        <w:t>duplicates were identified and addressed. A small number of transactions with missing quantity values were removed, as quantity is required to calculate revenue accurately.</w:t>
+        <w:rPr>
+          <w:rFonts w:ascii="Calibri" w:hAnsi="Calibri" w:cs="Calibri"/>
+        </w:rPr>
+        <w:t>contains records including product details, quantities, prices, regions, and salesperson information. During the cleaning process, missing values and</w:t>
+      </w:r>
+      <w:r>
+        <w:rPr>
+          <w:rFonts w:ascii="Calibri" w:hAnsi="Calibri" w:cs="Calibri"/>
+        </w:rPr>
+        <w:t xml:space="preserve"> </w:t>
+      </w:r>
+      <w:r>
+        <w:rPr>
+          <w:rFonts w:ascii="Calibri" w:hAnsi="Calibri" w:cs="Calibri"/>
+        </w:rPr>
+        <w:t xml:space="preserve">duplicates were addressed. A </w:t>
+      </w:r>
+      <w:r>
+        <w:rPr>
+          <w:rFonts w:ascii="Calibri" w:hAnsi="Calibri" w:cs="Calibri"/>
+        </w:rPr>
+        <w:t xml:space="preserve">few </w:t>
+      </w:r>
+      <w:r>
+        <w:rPr>
+          <w:rFonts w:ascii="Calibri" w:hAnsi="Calibri" w:cs="Calibri"/>
+        </w:rPr>
+        <w:t>transactions with missing quantity values were removed, as</w:t>
+      </w:r>
+      <w:r>
+        <w:rPr>
+          <w:rFonts w:ascii="Calibri" w:hAnsi="Calibri" w:cs="Calibri"/>
+        </w:rPr>
+        <w:t xml:space="preserve"> </w:t>
+      </w:r>
+      <w:r>
+        <w:rPr>
+          <w:rFonts w:ascii="Calibri" w:hAnsi="Calibri" w:cs="Calibri"/>
+        </w:rPr>
+        <w:t>quantity is required to calculate revenue accurately.</w:t>
+      </w:r>
+      <w:r>
+        <w:rPr>
+          <w:rFonts w:ascii="Calibri" w:hAnsi="Calibri" w:cs="Calibri"/>
+        </w:rPr>
+        <w:t xml:space="preserve"> </w:t>
+      </w:r>
+      <w:r>
+        <w:rPr>
+          <w:rFonts w:ascii="Calibri" w:hAnsi="Calibri" w:cs="Calibri"/>
+        </w:rPr>
+        <w:t>Missing</w:t>
+      </w:r>
+      <w:r>
+        <w:rPr>
+          <w:rFonts w:ascii="Calibri" w:hAnsi="Calibri" w:cs="Calibri"/>
+        </w:rPr>
+        <w:t xml:space="preserve"> </w:t>
+      </w:r>
+      <w:r>
+        <w:rPr>
+          <w:rFonts w:ascii="Calibri" w:hAnsi="Calibri" w:cs="Calibri"/>
+        </w:rPr>
+        <w:t>salesperson values were retained in their original form to preserve the integrity of the dataset.</w:t>
       </w:r>
     </w:p>
     <w:p>
       <w:pPr>
         <w:pStyle w:val="Heading2"/>
         <w:rPr>
+          <w:rFonts w:ascii="Calibri" w:hAnsi="Calibri" w:cs="Calibri"/>
           <w:color w:val="auto"/>
         </w:rPr>
       </w:pPr>
       <w:bookmarkStart w:id="4" w:name="_Toc228368036"/>
       <w:r>
         <w:rPr>
+          <w:rFonts w:ascii="Calibri" w:hAnsi="Calibri" w:cs="Calibri"/>
           <w:color w:val="auto"/>
         </w:rPr>
         <w:lastRenderedPageBreak/>
@@ -1195,10 +1436,14 @@
     <w:p>
       <w:pPr>
         <w:pStyle w:val="Heading3"/>
+        <w:rPr>
+          <w:rFonts w:ascii="Calibri" w:hAnsi="Calibri" w:cs="Calibri"/>
+        </w:rPr>
       </w:pPr>
       <w:bookmarkStart w:id="5" w:name="_Toc228368037"/>
       <w:r>
         <w:rPr>
+          <w:rFonts w:ascii="Calibri" w:hAnsi="Calibri" w:cs="Calibri"/>
           <w:color w:val="auto"/>
         </w:rPr>
         <w:t>Top Performing Region</w:t>
@@ -1206,8 +1451,14 @@
       <w:bookmarkEnd w:id="5"/>
     </w:p>
     <w:p>
+      <w:pPr>
+        <w:rPr>
+          <w:rFonts w:ascii="Calibri" w:hAnsi="Calibri" w:cs="Calibri"/>
+        </w:rPr>
+      </w:pPr>
       <w:r>
         <w:rPr>
+          <w:rFonts w:ascii="Calibri" w:hAnsi="Calibri" w:cs="Calibri"/>
           <w:noProof/>
         </w:rPr>
         <w:drawing>
@@ -1261,34 +1512,17 @@
         </w:drawing>
       </w:r>
       <w:r>
-        <w:t>The East Region</w:t>
-      </w:r>
-      <w:r>
-        <w:t xml:space="preserve"> perform</w:t>
-      </w:r>
-      <w:r>
-        <w:t>s</w:t>
-      </w:r>
-      <w:r>
-        <w:t xml:space="preserve"> the best in terms of revenue. It stands out compared to the other regions, which suggests that sales are much stronger there.</w:t>
-      </w:r>
-      <w:r>
-        <w:t xml:space="preserve"> T</w:t>
-      </w:r>
-      <w:r>
-        <w:t>he performance isn’t evenly spread across all regions. Some</w:t>
-      </w:r>
-      <w:r>
-        <w:t xml:space="preserve"> </w:t>
-      </w:r>
-      <w:r>
-        <w:t>regions are clearly doing much better than others. This could be because of higher demand, better sales coverage, or even stronger customer presence in that area.</w:t>
+        <w:rPr>
+          <w:rFonts w:ascii="Calibri" w:hAnsi="Calibri" w:cs="Calibri"/>
+        </w:rPr>
+        <w:t>The East Region performs the best in terms of revenue. It stands out compared to the other regions, which suggests that sales are much stronger there. The performance isn’t evenly spread across all regions. Some regions are clearly doing much better than others. This could be because of higher demand, better sales coverage, or even stronger customer presence in that area.</w:t>
       </w:r>
     </w:p>
     <w:p>
       <w:pPr>
         <w:pStyle w:val="Heading3"/>
         <w:rPr>
+          <w:rFonts w:ascii="Calibri" w:hAnsi="Calibri" w:cs="Calibri"/>
           <w:color w:val="auto"/>
         </w:rPr>
       </w:pPr>
@@ -1297,12 +1531,14 @@
       <w:pPr>
         <w:pStyle w:val="Heading3"/>
         <w:rPr>
+          <w:rFonts w:ascii="Calibri" w:hAnsi="Calibri" w:cs="Calibri"/>
           <w:color w:val="auto"/>
         </w:rPr>
       </w:pPr>
       <w:bookmarkStart w:id="6" w:name="_Toc228368038"/>
       <w:r>
         <w:rPr>
+          <w:rFonts w:ascii="Calibri" w:hAnsi="Calibri" w:cs="Calibri"/>
           <w:color w:val="auto"/>
         </w:rPr>
         <w:t>Highest revenue-generating products</w:t>
@@ -1310,24 +1546,31 @@
       <w:bookmarkEnd w:id="6"/>
       <w:r>
         <w:rPr>
+          <w:rFonts w:ascii="Calibri" w:hAnsi="Calibri" w:cs="Calibri"/>
           <w:color w:val="auto"/>
         </w:rPr>
         <w:t xml:space="preserve"> </w:t>
       </w:r>
     </w:p>
     <w:p>
+      <w:pPr>
+        <w:rPr>
+          <w:rFonts w:ascii="Calibri" w:hAnsi="Calibri" w:cs="Calibri"/>
+        </w:rPr>
+      </w:pPr>
       <w:r>
         <w:rPr>
+          <w:rFonts w:ascii="Calibri" w:hAnsi="Calibri" w:cs="Calibri"/>
           <w:noProof/>
         </w:rPr>
         <w:drawing>
-          <wp:anchor distT="0" distB="0" distL="114300" distR="114300" simplePos="0" relativeHeight="251661312" behindDoc="0" locked="0" layoutInCell="1" allowOverlap="1" wp14:anchorId="6413F03D" wp14:editId="5EC9A54C">
+          <wp:anchor distT="0" distB="0" distL="114300" distR="114300" simplePos="0" relativeHeight="251661312" behindDoc="0" locked="0" layoutInCell="1" allowOverlap="1" wp14:anchorId="6413F03D" wp14:editId="3930BED6">
             <wp:simplePos x="0" y="0"/>
             <wp:positionH relativeFrom="margin">
               <wp:align>center</wp:align>
             </wp:positionH>
             <wp:positionV relativeFrom="paragraph">
-              <wp:posOffset>1179195</wp:posOffset>
+              <wp:posOffset>838835</wp:posOffset>
             </wp:positionV>
             <wp:extent cx="3953427" cy="2572109"/>
             <wp:effectExtent l="0" t="0" r="9525" b="0"/>
@@ -1371,32 +1614,31 @@
         </w:drawing>
       </w:r>
       <w:r>
-        <w:t>When it comes to products,</w:t>
-      </w:r>
-      <w:r>
-        <w:t xml:space="preserve"> overall, Phones</w:t>
-      </w:r>
-      <w:r>
-        <w:t xml:space="preserve"> are generating the highest revenue</w:t>
-      </w:r>
-      <w:r>
-        <w:t xml:space="preserve"> of R440 000, which is higher than the rest of the products, with laptops following at 180 000 and tablets at 150 000. The remaining products contribute much less with desks at 75 000 and chairs at 58 500. T</w:t>
-      </w:r>
-      <w:r>
-        <w:t>his shows that the business is heavily driven by phone sales.</w:t>
+        <w:rPr>
+          <w:rFonts w:ascii="Calibri" w:hAnsi="Calibri" w:cs="Calibri"/>
+        </w:rPr>
+        <w:t>When it comes to products, overall, Phones are generating the highest revenue of R440 000, which is higher than the rest of the products, with laptops following at 180 000 and tablets at 150 000. The remaining products contribute much less with desks at 75 000 and chairs at 58 500. This shows that the business is heavily driven by phone sales.</w:t>
       </w:r>
     </w:p>
-    <w:p/>
     <w:p>
       <w:pPr>
+        <w:rPr>
+          <w:rFonts w:ascii="Calibri" w:hAnsi="Calibri" w:cs="Calibri"/>
+        </w:rPr>
+      </w:pPr>
+    </w:p>
+    <w:p>
+      <w:pPr>
         <w:pStyle w:val="Heading3"/>
         <w:rPr>
+          <w:rFonts w:ascii="Calibri" w:hAnsi="Calibri" w:cs="Calibri"/>
           <w:color w:val="auto"/>
         </w:rPr>
       </w:pPr>
       <w:bookmarkStart w:id="7" w:name="_Toc228368039"/>
       <w:r>
         <w:rPr>
+          <w:rFonts w:ascii="Calibri" w:hAnsi="Calibri" w:cs="Calibri"/>
           <w:color w:val="auto"/>
         </w:rPr>
         <w:lastRenderedPageBreak/>
@@ -1407,12 +1649,14 @@
     <w:p>
       <w:pPr>
         <w:rPr>
+          <w:rFonts w:ascii="Calibri" w:hAnsi="Calibri" w:cs="Calibri"/>
           <w:b/>
           <w:bCs/>
         </w:rPr>
       </w:pPr>
       <w:r>
         <w:rPr>
+          <w:rFonts w:ascii="Calibri" w:hAnsi="Calibri" w:cs="Calibri"/>
           <w:noProof/>
         </w:rPr>
         <w:drawing>
@@ -1466,56 +1710,30 @@
         </w:drawing>
       </w:r>
       <w:r>
-        <w:t>Looking at the monthly revenue, there’s a clear upward trend from January to March. Sales start at around 160</w:t>
-      </w:r>
-      <w:r>
-        <w:t xml:space="preserve"> </w:t>
-      </w:r>
-      <w:r>
-        <w:t>000 in January, increase to 200</w:t>
-      </w:r>
-      <w:r>
-        <w:t xml:space="preserve"> </w:t>
-      </w:r>
-      <w:r>
-        <w:t>500 in February, and then jump to 271</w:t>
-      </w:r>
-      <w:r>
-        <w:t xml:space="preserve"> </w:t>
-      </w:r>
-      <w:r>
-        <w:t>500 in March.</w:t>
-      </w:r>
-      <w:r>
-        <w:t xml:space="preserve"> </w:t>
-      </w:r>
-      <w:r>
-        <w:t>What stands out is that revenue levels off in April, staying at the same value as March</w:t>
-      </w:r>
-      <w:r>
-        <w:t xml:space="preserve">. </w:t>
-      </w:r>
-      <w:r>
-        <w:t>This suggests that growth was strong in the first few months but then stabilized.</w:t>
-      </w:r>
-      <w:r>
-        <w:t xml:space="preserve"> </w:t>
-      </w:r>
-      <w:r>
-        <w:t>Overall, this shows that the business experienced consistent growth early on, followed by a period where performance remained steady. This could mean that sales reached a peak, or demand stayed strong but didn’t continue increasing</w:t>
-      </w:r>
-      <w:r>
-        <w:t>.</w:t>
+        <w:rPr>
+          <w:rFonts w:ascii="Calibri" w:hAnsi="Calibri" w:cs="Calibri"/>
+        </w:rPr>
+        <w:t>Looking at the monthly revenue, there’s a clear upward trend from January to March. Sales start at around 160 000 in January, increase to 200 500 in February, and then jump to 271 500 in March. What stands out is that revenue levels off in April, staying at the same value as March. This suggests that growth was strong in the first few months but then stabilized. Overall, this shows that the business experienced consistent growth early on, followed by a period where performance remained steady. This could mean that sales reached a peak, or demand stayed strong but didn’t continue increasing.</w:t>
       </w:r>
     </w:p>
-    <w:p/>
     <w:p>
       <w:pPr>
+        <w:rPr>
+          <w:rFonts w:ascii="Calibri" w:hAnsi="Calibri" w:cs="Calibri"/>
+        </w:rPr>
+      </w:pPr>
+    </w:p>
+    <w:p>
+      <w:pPr>
         <w:pStyle w:val="Heading3"/>
+        <w:rPr>
+          <w:rFonts w:ascii="Calibri" w:hAnsi="Calibri" w:cs="Calibri"/>
+        </w:rPr>
       </w:pPr>
       <w:bookmarkStart w:id="8" w:name="_Toc228368040"/>
       <w:r>
         <w:rPr>
+          <w:rFonts w:ascii="Calibri" w:hAnsi="Calibri" w:cs="Calibri"/>
           <w:color w:val="auto"/>
         </w:rPr>
         <w:t>Top-performing Salespeople</w:t>
@@ -1523,8 +1741,14 @@
       <w:bookmarkEnd w:id="8"/>
     </w:p>
     <w:p>
+      <w:pPr>
+        <w:rPr>
+          <w:rFonts w:ascii="Calibri" w:hAnsi="Calibri" w:cs="Calibri"/>
+        </w:rPr>
+      </w:pPr>
       <w:r>
         <w:rPr>
+          <w:rFonts w:ascii="Calibri" w:hAnsi="Calibri" w:cs="Calibri"/>
           <w:noProof/>
         </w:rPr>
         <w:drawing>
@@ -1578,33 +1802,37 @@
         </w:drawing>
       </w:r>
       <w:r>
-        <w:t>There’s also a noticeable difference in how salespeople are performing.</w:t>
-      </w:r>
-      <w:r>
-        <w:t xml:space="preserve"> David </w:t>
-      </w:r>
-      <w:r>
-        <w:t>stands out as the top performer, generating the most revenue.</w:t>
-      </w:r>
-      <w:r>
-        <w:t xml:space="preserve"> </w:t>
-      </w:r>
-      <w:r>
-        <w:t xml:space="preserve">At the same time, </w:t>
-      </w:r>
-      <w:r>
-        <w:t>a few sales weren’t accompanied by a Salesperson leading to replacing the blank with Unknown with an amount of 21 000, which could fall under any other Salespersons amount they generated.</w:t>
+        <w:rPr>
+          <w:rFonts w:ascii="Calibri" w:hAnsi="Calibri" w:cs="Calibri"/>
+        </w:rPr>
+        <w:t>There’s also a noticeable difference in how salespeople are performing. David stands out as the top performer, generating the most revenue. At the same time, a few sales weren’t accompanied by a Salesperson leading to replacing the blank with Unknown with an amount of 21 000, which could fall under any other Salespersons amount they generated.</w:t>
       </w:r>
     </w:p>
-    <w:p/>
-    <w:p/>
     <w:p>
       <w:pPr>
+        <w:rPr>
+          <w:rFonts w:ascii="Calibri" w:hAnsi="Calibri" w:cs="Calibri"/>
+        </w:rPr>
+      </w:pPr>
+    </w:p>
+    <w:p>
+      <w:pPr>
+        <w:rPr>
+          <w:rFonts w:ascii="Calibri" w:hAnsi="Calibri" w:cs="Calibri"/>
+        </w:rPr>
+      </w:pPr>
+    </w:p>
+    <w:p>
+      <w:pPr>
         <w:pStyle w:val="Heading2"/>
+        <w:rPr>
+          <w:rFonts w:ascii="Calibri" w:hAnsi="Calibri" w:cs="Calibri"/>
+        </w:rPr>
       </w:pPr>
       <w:bookmarkStart w:id="9" w:name="_Toc228368041"/>
       <w:r>
         <w:rPr>
+          <w:rFonts w:ascii="Calibri" w:hAnsi="Calibri" w:cs="Calibri"/>
           <w:color w:val="auto"/>
         </w:rPr>
         <w:lastRenderedPageBreak/>
@@ -1612,6 +1840,7 @@
       </w:r>
       <w:r>
         <w:rPr>
+          <w:rFonts w:ascii="Calibri" w:hAnsi="Calibri" w:cs="Calibri"/>
           <w:color w:val="auto"/>
         </w:rPr>
         <w:t>. Recommendations</w:t>
@@ -1622,12 +1851,14 @@
       <w:pPr>
         <w:pStyle w:val="Heading3"/>
         <w:rPr>
+          <w:rFonts w:ascii="Calibri" w:hAnsi="Calibri" w:cs="Calibri"/>
           <w:color w:val="auto"/>
         </w:rPr>
       </w:pPr>
       <w:bookmarkStart w:id="10" w:name="_Toc228368042"/>
       <w:r>
         <w:rPr>
+          <w:rFonts w:ascii="Calibri" w:hAnsi="Calibri" w:cs="Calibri"/>
           <w:color w:val="auto"/>
         </w:rPr>
         <w:t>1. Focus on High-Performing Products</w:t>
@@ -1635,21 +1866,37 @@
       <w:bookmarkEnd w:id="10"/>
     </w:p>
     <w:p>
+      <w:pPr>
+        <w:rPr>
+          <w:rFonts w:ascii="Calibri" w:hAnsi="Calibri" w:cs="Calibri"/>
+        </w:rPr>
+      </w:pPr>
       <w:r>
+        <w:rPr>
+          <w:rFonts w:ascii="Calibri" w:hAnsi="Calibri" w:cs="Calibri"/>
+        </w:rPr>
         <w:t>Since phones generate the highest revenue by a large margin, the business should prioritise this product category through improved stock availability, marketing, and targeted promotions.</w:t>
       </w:r>
     </w:p>
-    <w:p/>
     <w:p>
       <w:pPr>
+        <w:rPr>
+          <w:rFonts w:ascii="Calibri" w:hAnsi="Calibri" w:cs="Calibri"/>
+        </w:rPr>
+      </w:pPr>
+    </w:p>
+    <w:p>
+      <w:pPr>
         <w:pStyle w:val="Heading3"/>
         <w:rPr>
+          <w:rFonts w:ascii="Calibri" w:hAnsi="Calibri" w:cs="Calibri"/>
           <w:color w:val="auto"/>
         </w:rPr>
       </w:pPr>
       <w:bookmarkStart w:id="11" w:name="_Toc228368043"/>
       <w:r>
         <w:rPr>
+          <w:rFonts w:ascii="Calibri" w:hAnsi="Calibri" w:cs="Calibri"/>
           <w:color w:val="auto"/>
         </w:rPr>
         <w:t>2. Improve Performance of Lower-Selling Products</w:t>
@@ -1657,27 +1904,44 @@
       <w:bookmarkEnd w:id="11"/>
     </w:p>
     <w:p>
+      <w:pPr>
+        <w:rPr>
+          <w:rFonts w:ascii="Calibri" w:hAnsi="Calibri" w:cs="Calibri"/>
+        </w:rPr>
+      </w:pPr>
       <w:r>
+        <w:rPr>
+          <w:rFonts w:ascii="Calibri" w:hAnsi="Calibri" w:cs="Calibri"/>
+        </w:rPr>
         <w:t>Products such as desks and chairs contribute relatively little revenue. The business should evaluate pricing, demand, and marketing strategies for these products to improve performance or reassess their value.</w:t>
       </w:r>
     </w:p>
-    <w:p/>
     <w:p>
       <w:pPr>
+        <w:rPr>
+          <w:rFonts w:ascii="Calibri" w:hAnsi="Calibri" w:cs="Calibri"/>
+        </w:rPr>
+      </w:pPr>
+    </w:p>
+    <w:p>
+      <w:pPr>
         <w:pStyle w:val="Heading3"/>
         <w:rPr>
+          <w:rFonts w:ascii="Calibri" w:hAnsi="Calibri" w:cs="Calibri"/>
           <w:color w:val="auto"/>
         </w:rPr>
       </w:pPr>
       <w:bookmarkStart w:id="12" w:name="_Toc228368044"/>
       <w:r>
         <w:rPr>
+          <w:rFonts w:ascii="Calibri" w:hAnsi="Calibri" w:cs="Calibri"/>
           <w:color w:val="auto"/>
         </w:rPr>
         <w:t>3</w:t>
       </w:r>
       <w:r>
         <w:rPr>
+          <w:rFonts w:ascii="Calibri" w:hAnsi="Calibri" w:cs="Calibri"/>
           <w:color w:val="auto"/>
         </w:rPr>
         <w:t>. Improve Data Quality Controls</w:t>
@@ -1685,11 +1949,25 @@
       <w:bookmarkEnd w:id="12"/>
     </w:p>
     <w:p>
+      <w:pPr>
+        <w:rPr>
+          <w:rFonts w:ascii="Calibri" w:hAnsi="Calibri" w:cs="Calibri"/>
+        </w:rPr>
+      </w:pPr>
       <w:r>
+        <w:rPr>
+          <w:rFonts w:ascii="Calibri" w:hAnsi="Calibri" w:cs="Calibri"/>
+        </w:rPr>
         <w:t>A small number of transactions contained missing quantity values and were removed to ensure accurate analysis. To prevent this in future, data validation rules should be implemented to ensure all key fields are completed during data entry.</w:t>
       </w:r>
     </w:p>
-    <w:p/>
+    <w:p>
+      <w:pPr>
+        <w:rPr>
+          <w:rFonts w:ascii="Calibri" w:hAnsi="Calibri" w:cs="Calibri"/>
+        </w:rPr>
+      </w:pPr>
+    </w:p>
     <w:sectPr>
       <w:pgSz w:w="11906" w:h="16838"/>
       <w:pgMar w:top="1440" w:right="1440" w:bottom="1440" w:left="1440" w:header="708" w:footer="708" w:gutter="0"/>
@@ -4484,7 +4762,6 @@
   <w:style w:type="character" w:default="1" w:styleId="DefaultParagraphFont">
     <w:name w:val="Default Paragraph Font"/>
     <w:uiPriority w:val="1"/>
-    <w:semiHidden/>
     <w:unhideWhenUsed/>
   </w:style>
   <w:style w:type="table" w:default="1" w:styleId="TableNormal">

</xml_diff>

<commit_message>
Commit all files. Data Analysis Project, SSIS Course
</commit_message>
<xml_diff>
--- a/Data Analysis Project/project/reports/Report.docx
+++ b/Data Analysis Project/project/reports/Report.docx
@@ -1314,7 +1314,13 @@
         <w:rPr>
           <w:rFonts w:ascii="Calibri" w:hAnsi="Calibri" w:cs="Calibri"/>
         </w:rPr>
-        <w:t xml:space="preserve"> Missing salesperson values were retained in their original form to preserve the integrity of the dataset.</w:t>
+        <w:t xml:space="preserve"> Missing salesperson values </w:t>
+      </w:r>
+      <w:r>
+        <w:rPr>
+          <w:rFonts w:ascii="Calibri" w:hAnsi="Calibri" w:cs="Calibri"/>
+        </w:rPr>
+        <w:t>were filled with ‘Unknown’ as this does not affect working with the data.</w:t>
       </w:r>
     </w:p>
     <w:p>

</xml_diff>